<commit_message>
Cap. XIII: traduz nomes das armaduras do catalogo, alinhando ao vocabulario do Cap. XI
</commit_message>
<xml_diff>
--- a/legacy/Recursos.docx
+++ b/legacy/Recursos.docx
@@ -42,6 +42,7 @@
             <w:pPr>
               <w:pStyle w:val="Normal"/>
               <w:widowControl/>
+              <w:suppressAutoHyphens w:val="true"/>
               <w:spacing w:lineRule="auto" w:line="240" w:before="0" w:after="0"/>
               <w:jc w:val="start"/>
               <w:rPr>
@@ -52,11 +53,9 @@
             </w:pPr>
             <w:r>
               <w:rPr>
-                <w:rFonts w:eastAsia="Calibri" w:cs="Arial" w:ascii="Arial" w:hAnsi="Arial"/>
-                <w:kern w:val="0"/>
-                <w:sz w:val="20"/>
-                <w:szCs w:val="20"/>
-                <w:lang w:val="pt-BR" w:eastAsia="en-US" w:bidi="ar-SA"/>
+                <w:rFonts w:cs="Arial" w:ascii="Arial" w:hAnsi="Arial"/>
+                <w:sz w:val="20"/>
+                <w:szCs w:val="20"/>
               </w:rPr>
             </w:r>
           </w:p>
@@ -70,6 +69,7 @@
             <w:pPr>
               <w:pStyle w:val="Normal"/>
               <w:widowControl/>
+              <w:suppressAutoHyphens w:val="true"/>
               <w:spacing w:lineRule="auto" w:line="240" w:before="0" w:after="0"/>
               <w:ind w:firstLine="1593" w:start="-1593"/>
               <w:jc w:val="center"/>
@@ -101,6 +101,7 @@
             <w:pPr>
               <w:pStyle w:val="Normal"/>
               <w:widowControl/>
+              <w:suppressAutoHyphens w:val="true"/>
               <w:spacing w:lineRule="auto" w:line="240" w:before="0" w:after="0"/>
               <w:jc w:val="center"/>
               <w:rPr>
@@ -131,6 +132,7 @@
             <w:pPr>
               <w:pStyle w:val="Normal"/>
               <w:widowControl/>
+              <w:suppressAutoHyphens w:val="true"/>
               <w:spacing w:lineRule="auto" w:line="240" w:before="0" w:after="0"/>
               <w:jc w:val="center"/>
               <w:rPr>
@@ -165,6 +167,7 @@
             <w:pPr>
               <w:pStyle w:val="Normal"/>
               <w:widowControl/>
+              <w:suppressAutoHyphens w:val="true"/>
               <w:spacing w:lineRule="auto" w:line="240" w:before="0" w:after="0"/>
               <w:jc w:val="start"/>
               <w:rPr>
@@ -194,6 +197,7 @@
             <w:pPr>
               <w:pStyle w:val="Normal"/>
               <w:widowControl/>
+              <w:suppressAutoHyphens w:val="true"/>
               <w:spacing w:lineRule="auto" w:line="240" w:before="0" w:after="0"/>
               <w:jc w:val="center"/>
               <w:rPr>
@@ -223,6 +227,7 @@
             <w:pPr>
               <w:pStyle w:val="Normal"/>
               <w:widowControl/>
+              <w:suppressAutoHyphens w:val="true"/>
               <w:spacing w:lineRule="auto" w:line="240" w:before="0" w:after="0"/>
               <w:jc w:val="center"/>
               <w:rPr>
@@ -252,6 +257,7 @@
             <w:pPr>
               <w:pStyle w:val="Normal"/>
               <w:widowControl/>
+              <w:suppressAutoHyphens w:val="true"/>
               <w:spacing w:lineRule="auto" w:line="240" w:before="0" w:after="0"/>
               <w:jc w:val="center"/>
               <w:rPr>
@@ -281,6 +287,7 @@
             <w:pPr>
               <w:pStyle w:val="Normal"/>
               <w:widowControl/>
+              <w:suppressAutoHyphens w:val="true"/>
               <w:spacing w:lineRule="auto" w:line="240" w:before="0" w:after="0"/>
               <w:jc w:val="center"/>
               <w:rPr>
@@ -310,6 +317,7 @@
             <w:pPr>
               <w:pStyle w:val="Normal"/>
               <w:widowControl/>
+              <w:suppressAutoHyphens w:val="true"/>
               <w:spacing w:lineRule="auto" w:line="240" w:before="0" w:after="0"/>
               <w:jc w:val="center"/>
               <w:rPr>
@@ -339,6 +347,7 @@
             <w:pPr>
               <w:pStyle w:val="Normal"/>
               <w:widowControl/>
+              <w:suppressAutoHyphens w:val="true"/>
               <w:spacing w:lineRule="auto" w:line="240" w:before="0" w:after="0"/>
               <w:jc w:val="center"/>
               <w:rPr>
@@ -373,6 +382,7 @@
             <w:pPr>
               <w:pStyle w:val="Normal"/>
               <w:widowControl/>
+              <w:suppressAutoHyphens w:val="true"/>
               <w:spacing w:lineRule="auto" w:line="240" w:before="0" w:after="0"/>
               <w:jc w:val="start"/>
               <w:rPr>
@@ -402,6 +412,7 @@
             <w:pPr>
               <w:pStyle w:val="Normal"/>
               <w:widowControl/>
+              <w:suppressAutoHyphens w:val="true"/>
               <w:spacing w:lineRule="auto" w:line="240" w:before="0" w:after="0"/>
               <w:jc w:val="center"/>
               <w:rPr>
@@ -431,6 +442,7 @@
             <w:pPr>
               <w:pStyle w:val="Normal"/>
               <w:widowControl/>
+              <w:suppressAutoHyphens w:val="true"/>
               <w:spacing w:lineRule="auto" w:line="240" w:before="0" w:after="0"/>
               <w:jc w:val="center"/>
               <w:rPr>
@@ -460,6 +472,7 @@
             <w:pPr>
               <w:pStyle w:val="Normal"/>
               <w:widowControl/>
+              <w:suppressAutoHyphens w:val="true"/>
               <w:spacing w:lineRule="auto" w:line="240" w:before="0" w:after="0"/>
               <w:jc w:val="center"/>
               <w:rPr>
@@ -489,6 +502,7 @@
             <w:pPr>
               <w:pStyle w:val="Normal"/>
               <w:widowControl/>
+              <w:suppressAutoHyphens w:val="true"/>
               <w:spacing w:lineRule="auto" w:line="240" w:before="0" w:after="0"/>
               <w:jc w:val="center"/>
               <w:rPr>
@@ -518,6 +532,7 @@
             <w:pPr>
               <w:pStyle w:val="Normal"/>
               <w:widowControl/>
+              <w:suppressAutoHyphens w:val="true"/>
               <w:spacing w:lineRule="auto" w:line="240" w:before="0" w:after="0"/>
               <w:jc w:val="center"/>
               <w:rPr>
@@ -547,6 +562,7 @@
             <w:pPr>
               <w:pStyle w:val="Normal"/>
               <w:widowControl/>
+              <w:suppressAutoHyphens w:val="true"/>
               <w:spacing w:lineRule="auto" w:line="240" w:before="0" w:after="0"/>
               <w:jc w:val="center"/>
               <w:rPr>
@@ -581,6 +597,7 @@
             <w:pPr>
               <w:pStyle w:val="Normal"/>
               <w:widowControl/>
+              <w:suppressAutoHyphens w:val="true"/>
               <w:spacing w:lineRule="auto" w:line="240" w:before="0" w:after="0"/>
               <w:jc w:val="start"/>
               <w:rPr>
@@ -610,6 +627,7 @@
             <w:pPr>
               <w:pStyle w:val="Normal"/>
               <w:widowControl/>
+              <w:suppressAutoHyphens w:val="true"/>
               <w:spacing w:lineRule="auto" w:line="240" w:before="0" w:after="0"/>
               <w:jc w:val="center"/>
               <w:rPr>
@@ -639,6 +657,7 @@
             <w:pPr>
               <w:pStyle w:val="Normal"/>
               <w:widowControl/>
+              <w:suppressAutoHyphens w:val="true"/>
               <w:spacing w:lineRule="auto" w:line="240" w:before="0" w:after="0"/>
               <w:jc w:val="center"/>
               <w:rPr>
@@ -668,6 +687,7 @@
             <w:pPr>
               <w:pStyle w:val="Normal"/>
               <w:widowControl/>
+              <w:suppressAutoHyphens w:val="true"/>
               <w:spacing w:lineRule="auto" w:line="240" w:before="0" w:after="0"/>
               <w:jc w:val="center"/>
               <w:rPr>
@@ -697,6 +717,7 @@
             <w:pPr>
               <w:pStyle w:val="Normal"/>
               <w:widowControl/>
+              <w:suppressAutoHyphens w:val="true"/>
               <w:spacing w:lineRule="auto" w:line="240" w:before="0" w:after="0"/>
               <w:jc w:val="center"/>
               <w:rPr>
@@ -726,6 +747,7 @@
             <w:pPr>
               <w:pStyle w:val="Normal"/>
               <w:widowControl/>
+              <w:suppressAutoHyphens w:val="true"/>
               <w:spacing w:lineRule="auto" w:line="240" w:before="0" w:after="0"/>
               <w:jc w:val="center"/>
               <w:rPr>
@@ -755,6 +777,7 @@
             <w:pPr>
               <w:pStyle w:val="Normal"/>
               <w:widowControl/>
+              <w:suppressAutoHyphens w:val="true"/>
               <w:spacing w:lineRule="auto" w:line="240" w:before="0" w:after="0"/>
               <w:jc w:val="center"/>
               <w:rPr>
@@ -789,6 +812,7 @@
             <w:pPr>
               <w:pStyle w:val="Normal"/>
               <w:widowControl/>
+              <w:suppressAutoHyphens w:val="true"/>
               <w:spacing w:lineRule="auto" w:line="240" w:before="0" w:after="0"/>
               <w:jc w:val="start"/>
               <w:rPr>
@@ -818,6 +842,7 @@
             <w:pPr>
               <w:pStyle w:val="Normal"/>
               <w:widowControl/>
+              <w:suppressAutoHyphens w:val="true"/>
               <w:spacing w:lineRule="auto" w:line="240" w:before="0" w:after="0"/>
               <w:jc w:val="center"/>
               <w:rPr>
@@ -847,6 +872,7 @@
             <w:pPr>
               <w:pStyle w:val="Normal"/>
               <w:widowControl/>
+              <w:suppressAutoHyphens w:val="true"/>
               <w:spacing w:lineRule="auto" w:line="240" w:before="0" w:after="0"/>
               <w:jc w:val="center"/>
               <w:rPr>
@@ -876,6 +902,7 @@
             <w:pPr>
               <w:pStyle w:val="Normal"/>
               <w:widowControl/>
+              <w:suppressAutoHyphens w:val="true"/>
               <w:spacing w:lineRule="auto" w:line="240" w:before="0" w:after="0"/>
               <w:jc w:val="center"/>
               <w:rPr>
@@ -905,6 +932,7 @@
             <w:pPr>
               <w:pStyle w:val="Normal"/>
               <w:widowControl/>
+              <w:suppressAutoHyphens w:val="true"/>
               <w:spacing w:lineRule="auto" w:line="240" w:before="0" w:after="0"/>
               <w:jc w:val="center"/>
               <w:rPr>
@@ -934,6 +962,7 @@
             <w:pPr>
               <w:pStyle w:val="Normal"/>
               <w:widowControl/>
+              <w:suppressAutoHyphens w:val="true"/>
               <w:spacing w:lineRule="auto" w:line="240" w:before="0" w:after="0"/>
               <w:jc w:val="center"/>
               <w:rPr>
@@ -963,6 +992,7 @@
             <w:pPr>
               <w:pStyle w:val="Normal"/>
               <w:widowControl/>
+              <w:suppressAutoHyphens w:val="true"/>
               <w:spacing w:lineRule="auto" w:line="240" w:before="0" w:after="0"/>
               <w:jc w:val="center"/>
               <w:rPr>
@@ -997,6 +1027,7 @@
             <w:pPr>
               <w:pStyle w:val="Normal"/>
               <w:widowControl/>
+              <w:suppressAutoHyphens w:val="true"/>
               <w:spacing w:lineRule="auto" w:line="240" w:before="0" w:after="0"/>
               <w:jc w:val="start"/>
               <w:rPr>
@@ -1026,6 +1057,7 @@
             <w:pPr>
               <w:pStyle w:val="Normal"/>
               <w:widowControl/>
+              <w:suppressAutoHyphens w:val="true"/>
               <w:spacing w:lineRule="auto" w:line="240" w:before="0" w:after="0"/>
               <w:jc w:val="center"/>
               <w:rPr>
@@ -1055,6 +1087,7 @@
             <w:pPr>
               <w:pStyle w:val="Normal"/>
               <w:widowControl/>
+              <w:suppressAutoHyphens w:val="true"/>
               <w:spacing w:lineRule="auto" w:line="240" w:before="0" w:after="0"/>
               <w:jc w:val="center"/>
               <w:rPr>
@@ -1084,6 +1117,7 @@
             <w:pPr>
               <w:pStyle w:val="Normal"/>
               <w:widowControl/>
+              <w:suppressAutoHyphens w:val="true"/>
               <w:spacing w:lineRule="auto" w:line="240" w:before="0" w:after="0"/>
               <w:jc w:val="center"/>
               <w:rPr>
@@ -1113,6 +1147,7 @@
             <w:pPr>
               <w:pStyle w:val="Normal"/>
               <w:widowControl/>
+              <w:suppressAutoHyphens w:val="true"/>
               <w:spacing w:lineRule="auto" w:line="240" w:before="0" w:after="0"/>
               <w:jc w:val="center"/>
               <w:rPr>
@@ -1142,6 +1177,7 @@
             <w:pPr>
               <w:pStyle w:val="Normal"/>
               <w:widowControl/>
+              <w:suppressAutoHyphens w:val="true"/>
               <w:spacing w:lineRule="auto" w:line="240" w:before="0" w:after="0"/>
               <w:jc w:val="center"/>
               <w:rPr>
@@ -1171,6 +1207,7 @@
             <w:pPr>
               <w:pStyle w:val="Normal"/>
               <w:widowControl/>
+              <w:suppressAutoHyphens w:val="true"/>
               <w:spacing w:lineRule="auto" w:line="240" w:before="0" w:after="0"/>
               <w:jc w:val="center"/>
               <w:rPr>
@@ -1205,6 +1242,7 @@
             <w:pPr>
               <w:pStyle w:val="Normal"/>
               <w:widowControl/>
+              <w:suppressAutoHyphens w:val="true"/>
               <w:spacing w:lineRule="auto" w:line="240" w:before="0" w:after="0"/>
               <w:jc w:val="start"/>
               <w:rPr>
@@ -1234,6 +1272,7 @@
             <w:pPr>
               <w:pStyle w:val="Normal"/>
               <w:widowControl/>
+              <w:suppressAutoHyphens w:val="true"/>
               <w:spacing w:lineRule="auto" w:line="240" w:before="0" w:after="0"/>
               <w:jc w:val="center"/>
               <w:rPr>
@@ -1263,6 +1302,7 @@
             <w:pPr>
               <w:pStyle w:val="Normal"/>
               <w:widowControl/>
+              <w:suppressAutoHyphens w:val="true"/>
               <w:spacing w:lineRule="auto" w:line="240" w:before="0" w:after="0"/>
               <w:jc w:val="center"/>
               <w:rPr>
@@ -1292,6 +1332,7 @@
             <w:pPr>
               <w:pStyle w:val="Normal"/>
               <w:widowControl/>
+              <w:suppressAutoHyphens w:val="true"/>
               <w:spacing w:lineRule="auto" w:line="240" w:before="0" w:after="0"/>
               <w:jc w:val="center"/>
               <w:rPr>
@@ -1321,6 +1362,7 @@
             <w:pPr>
               <w:pStyle w:val="Normal"/>
               <w:widowControl/>
+              <w:suppressAutoHyphens w:val="true"/>
               <w:spacing w:lineRule="auto" w:line="240" w:before="0" w:after="0"/>
               <w:jc w:val="center"/>
               <w:rPr>
@@ -1350,6 +1392,7 @@
             <w:pPr>
               <w:pStyle w:val="Normal"/>
               <w:widowControl/>
+              <w:suppressAutoHyphens w:val="true"/>
               <w:spacing w:lineRule="auto" w:line="240" w:before="0" w:after="0"/>
               <w:jc w:val="center"/>
               <w:rPr>
@@ -1379,6 +1422,7 @@
             <w:pPr>
               <w:pStyle w:val="Normal"/>
               <w:widowControl/>
+              <w:suppressAutoHyphens w:val="true"/>
               <w:spacing w:lineRule="auto" w:line="240" w:before="0" w:after="0"/>
               <w:jc w:val="center"/>
               <w:rPr>
@@ -1413,6 +1457,7 @@
             <w:pPr>
               <w:pStyle w:val="Normal"/>
               <w:widowControl/>
+              <w:suppressAutoHyphens w:val="true"/>
               <w:spacing w:lineRule="auto" w:line="240" w:before="0" w:after="0"/>
               <w:jc w:val="start"/>
               <w:rPr>
@@ -1442,6 +1487,7 @@
             <w:pPr>
               <w:pStyle w:val="Normal"/>
               <w:widowControl/>
+              <w:suppressAutoHyphens w:val="true"/>
               <w:spacing w:lineRule="auto" w:line="240" w:before="0" w:after="0"/>
               <w:jc w:val="center"/>
               <w:rPr>
@@ -1471,6 +1517,7 @@
             <w:pPr>
               <w:pStyle w:val="Normal"/>
               <w:widowControl/>
+              <w:suppressAutoHyphens w:val="true"/>
               <w:spacing w:lineRule="auto" w:line="240" w:before="0" w:after="0"/>
               <w:jc w:val="center"/>
               <w:rPr>
@@ -1500,6 +1547,7 @@
             <w:pPr>
               <w:pStyle w:val="Normal"/>
               <w:widowControl/>
+              <w:suppressAutoHyphens w:val="true"/>
               <w:spacing w:lineRule="auto" w:line="240" w:before="0" w:after="0"/>
               <w:jc w:val="center"/>
               <w:rPr>
@@ -1529,6 +1577,7 @@
             <w:pPr>
               <w:pStyle w:val="Normal"/>
               <w:widowControl/>
+              <w:suppressAutoHyphens w:val="true"/>
               <w:spacing w:lineRule="auto" w:line="240" w:before="0" w:after="0"/>
               <w:jc w:val="center"/>
               <w:rPr>
@@ -1558,6 +1607,7 @@
             <w:pPr>
               <w:pStyle w:val="Normal"/>
               <w:widowControl/>
+              <w:suppressAutoHyphens w:val="true"/>
               <w:spacing w:lineRule="auto" w:line="240" w:before="0" w:after="0"/>
               <w:jc w:val="center"/>
               <w:rPr>
@@ -1587,6 +1637,7 @@
             <w:pPr>
               <w:pStyle w:val="Normal"/>
               <w:widowControl/>
+              <w:suppressAutoHyphens w:val="true"/>
               <w:spacing w:lineRule="auto" w:line="240" w:before="0" w:after="0"/>
               <w:jc w:val="center"/>
               <w:rPr>
@@ -1621,6 +1672,7 @@
             <w:pPr>
               <w:pStyle w:val="Normal"/>
               <w:widowControl/>
+              <w:suppressAutoHyphens w:val="true"/>
               <w:spacing w:lineRule="auto" w:line="240" w:before="0" w:after="0"/>
               <w:jc w:val="start"/>
               <w:rPr>
@@ -1650,6 +1702,7 @@
             <w:pPr>
               <w:pStyle w:val="Normal"/>
               <w:widowControl/>
+              <w:suppressAutoHyphens w:val="true"/>
               <w:spacing w:lineRule="auto" w:line="240" w:before="0" w:after="0"/>
               <w:jc w:val="center"/>
               <w:rPr>
@@ -1679,6 +1732,7 @@
             <w:pPr>
               <w:pStyle w:val="Normal"/>
               <w:widowControl/>
+              <w:suppressAutoHyphens w:val="true"/>
               <w:spacing w:lineRule="auto" w:line="240" w:before="0" w:after="0"/>
               <w:jc w:val="center"/>
               <w:rPr>
@@ -1708,6 +1762,7 @@
             <w:pPr>
               <w:pStyle w:val="Normal"/>
               <w:widowControl/>
+              <w:suppressAutoHyphens w:val="true"/>
               <w:spacing w:lineRule="auto" w:line="240" w:before="0" w:after="0"/>
               <w:jc w:val="center"/>
               <w:rPr>
@@ -1737,6 +1792,7 @@
             <w:pPr>
               <w:pStyle w:val="Normal"/>
               <w:widowControl/>
+              <w:suppressAutoHyphens w:val="true"/>
               <w:spacing w:lineRule="auto" w:line="240" w:before="0" w:after="0"/>
               <w:jc w:val="center"/>
               <w:rPr>
@@ -1766,6 +1822,7 @@
             <w:pPr>
               <w:pStyle w:val="Normal"/>
               <w:widowControl/>
+              <w:suppressAutoHyphens w:val="true"/>
               <w:spacing w:lineRule="auto" w:line="240" w:before="0" w:after="0"/>
               <w:jc w:val="center"/>
               <w:rPr>
@@ -1795,6 +1852,7 @@
             <w:pPr>
               <w:pStyle w:val="Normal"/>
               <w:widowControl/>
+              <w:suppressAutoHyphens w:val="true"/>
               <w:spacing w:lineRule="auto" w:line="240" w:before="0" w:after="0"/>
               <w:jc w:val="center"/>
               <w:rPr>
@@ -1829,6 +1887,7 @@
             <w:pPr>
               <w:pStyle w:val="Normal"/>
               <w:widowControl/>
+              <w:suppressAutoHyphens w:val="true"/>
               <w:spacing w:lineRule="auto" w:line="240" w:before="0" w:after="0"/>
               <w:jc w:val="start"/>
               <w:rPr>
@@ -1858,6 +1917,7 @@
             <w:pPr>
               <w:pStyle w:val="Normal"/>
               <w:widowControl/>
+              <w:suppressAutoHyphens w:val="true"/>
               <w:spacing w:lineRule="auto" w:line="240" w:before="0" w:after="0"/>
               <w:jc w:val="center"/>
               <w:rPr>
@@ -1887,6 +1947,7 @@
             <w:pPr>
               <w:pStyle w:val="Normal"/>
               <w:widowControl/>
+              <w:suppressAutoHyphens w:val="true"/>
               <w:spacing w:lineRule="auto" w:line="240" w:before="0" w:after="0"/>
               <w:jc w:val="center"/>
               <w:rPr>
@@ -1916,6 +1977,7 @@
             <w:pPr>
               <w:pStyle w:val="Normal"/>
               <w:widowControl/>
+              <w:suppressAutoHyphens w:val="true"/>
               <w:spacing w:lineRule="auto" w:line="240" w:before="0" w:after="0"/>
               <w:jc w:val="center"/>
               <w:rPr>
@@ -1945,6 +2007,7 @@
             <w:pPr>
               <w:pStyle w:val="Normal"/>
               <w:widowControl/>
+              <w:suppressAutoHyphens w:val="true"/>
               <w:spacing w:lineRule="auto" w:line="240" w:before="0" w:after="0"/>
               <w:jc w:val="center"/>
               <w:rPr>
@@ -1974,6 +2037,7 @@
             <w:pPr>
               <w:pStyle w:val="Normal"/>
               <w:widowControl/>
+              <w:suppressAutoHyphens w:val="true"/>
               <w:spacing w:lineRule="auto" w:line="240" w:before="0" w:after="0"/>
               <w:jc w:val="center"/>
               <w:rPr>
@@ -2003,6 +2067,7 @@
             <w:pPr>
               <w:pStyle w:val="Normal"/>
               <w:widowControl/>
+              <w:suppressAutoHyphens w:val="true"/>
               <w:spacing w:lineRule="auto" w:line="240" w:before="0" w:after="0"/>
               <w:jc w:val="center"/>
               <w:rPr>
@@ -2035,7 +2100,7 @@
       </w:pPr>
       <w:r>
         <w:rPr>
-          <w:rFonts w:cs="Arial" w:ascii="Calibri" w:hAnsi="Calibri"/>
+          <w:rFonts w:cs="Arial"/>
         </w:rPr>
       </w:r>
     </w:p>
@@ -2138,8 +2203,8 @@
         <w:tblLook w:val="04a0" w:firstRow="1" w:noVBand="1" w:lastRow="0" w:firstColumn="1" w:lastColumn="0" w:noHBand="0"/>
       </w:tblPr>
       <w:tblGrid>
-        <w:gridCol w:w="1328"/>
-        <w:gridCol w:w="1332"/>
+        <w:gridCol w:w="1327"/>
+        <w:gridCol w:w="1333"/>
         <w:gridCol w:w="1331"/>
         <w:gridCol w:w="1331"/>
       </w:tblGrid>
@@ -2149,7 +2214,7 @@
         </w:trPr>
         <w:tc>
           <w:tcPr>
-            <w:tcW w:w="1328" w:type="dxa"/>
+            <w:tcW w:w="1327" w:type="dxa"/>
             <w:tcBorders>
               <w:top w:val="nil"/>
               <w:start w:val="nil"/>
@@ -2159,6 +2224,7 @@
             <w:pPr>
               <w:pStyle w:val="Normal"/>
               <w:widowControl/>
+              <w:suppressAutoHyphens w:val="true"/>
               <w:spacing w:lineRule="auto" w:line="240" w:before="0" w:after="0"/>
               <w:jc w:val="center"/>
               <w:rPr>
@@ -2168,24 +2234,51 @@
             </w:pPr>
             <w:r>
               <w:rPr>
+                <w:sz w:val="20"/>
+                <w:szCs w:val="20"/>
+              </w:rPr>
+            </w:r>
+          </w:p>
+        </w:tc>
+        <w:tc>
+          <w:tcPr>
+            <w:tcW w:w="1333" w:type="dxa"/>
+            <w:tcBorders/>
+          </w:tcPr>
+          <w:p>
+            <w:pPr>
+              <w:pStyle w:val="Normal"/>
+              <w:widowControl/>
+              <w:suppressAutoHyphens w:val="true"/>
+              <w:spacing w:lineRule="auto" w:line="240" w:before="0" w:after="0"/>
+              <w:jc w:val="center"/>
+              <w:rPr>
+                <w:sz w:val="20"/>
+                <w:szCs w:val="20"/>
+              </w:rPr>
+            </w:pPr>
+            <w:r>
+              <w:rPr>
                 <w:rFonts w:eastAsia="Calibri" w:cs=""/>
                 <w:kern w:val="0"/>
                 <w:sz w:val="20"/>
                 <w:szCs w:val="20"/>
                 <w:lang w:val="pt-BR" w:eastAsia="en-US" w:bidi="ar-SA"/>
               </w:rPr>
-            </w:r>
-          </w:p>
-        </w:tc>
-        <w:tc>
-          <w:tcPr>
-            <w:tcW w:w="1332" w:type="dxa"/>
-            <w:tcBorders/>
-          </w:tcPr>
-          <w:p>
-            <w:pPr>
-              <w:pStyle w:val="Normal"/>
-              <w:widowControl/>
+              <w:t>Peso</w:t>
+            </w:r>
+          </w:p>
+        </w:tc>
+        <w:tc>
+          <w:tcPr>
+            <w:tcW w:w="1331" w:type="dxa"/>
+            <w:tcBorders/>
+          </w:tcPr>
+          <w:p>
+            <w:pPr>
+              <w:pStyle w:val="Normal"/>
+              <w:widowControl/>
+              <w:suppressAutoHyphens w:val="true"/>
               <w:spacing w:lineRule="auto" w:line="240" w:before="0" w:after="0"/>
               <w:jc w:val="center"/>
               <w:rPr>
@@ -2201,7 +2294,7 @@
                 <w:szCs w:val="20"/>
                 <w:lang w:val="pt-BR" w:eastAsia="en-US" w:bidi="ar-SA"/>
               </w:rPr>
-              <w:t>Peso</w:t>
+              <w:t>Diâmetro</w:t>
             </w:r>
           </w:p>
         </w:tc>
@@ -2214,34 +2307,7 @@
             <w:pPr>
               <w:pStyle w:val="Normal"/>
               <w:widowControl/>
-              <w:spacing w:lineRule="auto" w:line="240" w:before="0" w:after="0"/>
-              <w:jc w:val="center"/>
-              <w:rPr>
-                <w:sz w:val="20"/>
-                <w:szCs w:val="20"/>
-              </w:rPr>
-            </w:pPr>
-            <w:r>
-              <w:rPr>
-                <w:rFonts w:eastAsia="Calibri" w:cs=""/>
-                <w:kern w:val="0"/>
-                <w:sz w:val="20"/>
-                <w:szCs w:val="20"/>
-                <w:lang w:val="pt-BR" w:eastAsia="en-US" w:bidi="ar-SA"/>
-              </w:rPr>
-              <w:t>Diâmetro</w:t>
-            </w:r>
-          </w:p>
-        </w:tc>
-        <w:tc>
-          <w:tcPr>
-            <w:tcW w:w="1331" w:type="dxa"/>
-            <w:tcBorders/>
-          </w:tcPr>
-          <w:p>
-            <w:pPr>
-              <w:pStyle w:val="Normal"/>
-              <w:widowControl/>
+              <w:suppressAutoHyphens w:val="true"/>
               <w:spacing w:lineRule="auto" w:line="240" w:before="0" w:after="0"/>
               <w:jc w:val="center"/>
               <w:rPr>
@@ -2268,13 +2334,14 @@
         </w:trPr>
         <w:tc>
           <w:tcPr>
-            <w:tcW w:w="1328" w:type="dxa"/>
-            <w:tcBorders/>
-          </w:tcPr>
-          <w:p>
-            <w:pPr>
-              <w:pStyle w:val="Normal"/>
-              <w:widowControl/>
+            <w:tcW w:w="1327" w:type="dxa"/>
+            <w:tcBorders/>
+          </w:tcPr>
+          <w:p>
+            <w:pPr>
+              <w:pStyle w:val="Normal"/>
+              <w:widowControl/>
+              <w:suppressAutoHyphens w:val="true"/>
               <w:spacing w:lineRule="auto" w:line="240" w:before="0" w:after="0"/>
               <w:jc w:val="center"/>
               <w:rPr>
@@ -2296,13 +2363,14 @@
         </w:tc>
         <w:tc>
           <w:tcPr>
-            <w:tcW w:w="1332" w:type="dxa"/>
-            <w:tcBorders/>
-          </w:tcPr>
-          <w:p>
-            <w:pPr>
-              <w:pStyle w:val="Normal"/>
-              <w:widowControl/>
+            <w:tcW w:w="1333" w:type="dxa"/>
+            <w:tcBorders/>
+          </w:tcPr>
+          <w:p>
+            <w:pPr>
+              <w:pStyle w:val="Normal"/>
+              <w:widowControl/>
+              <w:suppressAutoHyphens w:val="true"/>
               <w:spacing w:lineRule="auto" w:line="240" w:before="0" w:after="0"/>
               <w:jc w:val="center"/>
               <w:rPr>
@@ -2331,6 +2399,7 @@
             <w:pPr>
               <w:pStyle w:val="Normal"/>
               <w:widowControl/>
+              <w:suppressAutoHyphens w:val="true"/>
               <w:spacing w:lineRule="auto" w:line="240" w:before="0" w:after="0"/>
               <w:jc w:val="center"/>
               <w:rPr>
@@ -2359,6 +2428,7 @@
             <w:pPr>
               <w:pStyle w:val="Normal"/>
               <w:widowControl/>
+              <w:suppressAutoHyphens w:val="true"/>
               <w:spacing w:lineRule="auto" w:line="240" w:before="0" w:after="0"/>
               <w:jc w:val="center"/>
               <w:rPr>
@@ -2385,13 +2455,14 @@
         </w:trPr>
         <w:tc>
           <w:tcPr>
-            <w:tcW w:w="1328" w:type="dxa"/>
-            <w:tcBorders/>
-          </w:tcPr>
-          <w:p>
-            <w:pPr>
-              <w:pStyle w:val="Normal"/>
-              <w:widowControl/>
+            <w:tcW w:w="1327" w:type="dxa"/>
+            <w:tcBorders/>
+          </w:tcPr>
+          <w:p>
+            <w:pPr>
+              <w:pStyle w:val="Normal"/>
+              <w:widowControl/>
+              <w:suppressAutoHyphens w:val="true"/>
               <w:spacing w:lineRule="auto" w:line="240" w:before="0" w:after="0"/>
               <w:jc w:val="center"/>
               <w:rPr>
@@ -2413,13 +2484,14 @@
         </w:tc>
         <w:tc>
           <w:tcPr>
-            <w:tcW w:w="1332" w:type="dxa"/>
-            <w:tcBorders/>
-          </w:tcPr>
-          <w:p>
-            <w:pPr>
-              <w:pStyle w:val="Normal"/>
-              <w:widowControl/>
+            <w:tcW w:w="1333" w:type="dxa"/>
+            <w:tcBorders/>
+          </w:tcPr>
+          <w:p>
+            <w:pPr>
+              <w:pStyle w:val="Normal"/>
+              <w:widowControl/>
+              <w:suppressAutoHyphens w:val="true"/>
               <w:spacing w:lineRule="auto" w:line="240" w:before="0" w:after="0"/>
               <w:jc w:val="center"/>
               <w:rPr>
@@ -2448,6 +2520,7 @@
             <w:pPr>
               <w:pStyle w:val="Normal"/>
               <w:widowControl/>
+              <w:suppressAutoHyphens w:val="true"/>
               <w:spacing w:lineRule="auto" w:line="240" w:before="0" w:after="0"/>
               <w:jc w:val="center"/>
               <w:rPr>
@@ -2476,6 +2549,7 @@
             <w:pPr>
               <w:pStyle w:val="Normal"/>
               <w:widowControl/>
+              <w:suppressAutoHyphens w:val="true"/>
               <w:spacing w:lineRule="auto" w:line="240" w:before="0" w:after="0"/>
               <w:jc w:val="center"/>
               <w:rPr>
@@ -2502,13 +2576,14 @@
         </w:trPr>
         <w:tc>
           <w:tcPr>
-            <w:tcW w:w="1328" w:type="dxa"/>
-            <w:tcBorders/>
-          </w:tcPr>
-          <w:p>
-            <w:pPr>
-              <w:pStyle w:val="Normal"/>
-              <w:widowControl/>
+            <w:tcW w:w="1327" w:type="dxa"/>
+            <w:tcBorders/>
+          </w:tcPr>
+          <w:p>
+            <w:pPr>
+              <w:pStyle w:val="Normal"/>
+              <w:widowControl/>
+              <w:suppressAutoHyphens w:val="true"/>
               <w:spacing w:lineRule="auto" w:line="240" w:before="0" w:after="0"/>
               <w:jc w:val="center"/>
               <w:rPr>
@@ -2530,13 +2605,14 @@
         </w:tc>
         <w:tc>
           <w:tcPr>
-            <w:tcW w:w="1332" w:type="dxa"/>
-            <w:tcBorders/>
-          </w:tcPr>
-          <w:p>
-            <w:pPr>
-              <w:pStyle w:val="Normal"/>
-              <w:widowControl/>
+            <w:tcW w:w="1333" w:type="dxa"/>
+            <w:tcBorders/>
+          </w:tcPr>
+          <w:p>
+            <w:pPr>
+              <w:pStyle w:val="Normal"/>
+              <w:widowControl/>
+              <w:suppressAutoHyphens w:val="true"/>
               <w:spacing w:lineRule="auto" w:line="240" w:before="0" w:after="0"/>
               <w:jc w:val="center"/>
               <w:rPr>
@@ -2565,6 +2641,7 @@
             <w:pPr>
               <w:pStyle w:val="Normal"/>
               <w:widowControl/>
+              <w:suppressAutoHyphens w:val="true"/>
               <w:spacing w:lineRule="auto" w:line="240" w:before="0" w:after="0"/>
               <w:jc w:val="center"/>
               <w:rPr>
@@ -2593,6 +2670,7 @@
             <w:pPr>
               <w:pStyle w:val="Normal"/>
               <w:widowControl/>
+              <w:suppressAutoHyphens w:val="true"/>
               <w:spacing w:lineRule="auto" w:line="240" w:before="0" w:after="0"/>
               <w:jc w:val="center"/>
               <w:rPr>
@@ -2619,13 +2697,14 @@
         </w:trPr>
         <w:tc>
           <w:tcPr>
-            <w:tcW w:w="1328" w:type="dxa"/>
-            <w:tcBorders/>
-          </w:tcPr>
-          <w:p>
-            <w:pPr>
-              <w:pStyle w:val="Normal"/>
-              <w:widowControl/>
+            <w:tcW w:w="1327" w:type="dxa"/>
+            <w:tcBorders/>
+          </w:tcPr>
+          <w:p>
+            <w:pPr>
+              <w:pStyle w:val="Normal"/>
+              <w:widowControl/>
+              <w:suppressAutoHyphens w:val="true"/>
               <w:spacing w:lineRule="auto" w:line="240" w:before="0" w:after="0"/>
               <w:jc w:val="center"/>
               <w:rPr>
@@ -2647,13 +2726,14 @@
         </w:tc>
         <w:tc>
           <w:tcPr>
-            <w:tcW w:w="1332" w:type="dxa"/>
-            <w:tcBorders/>
-          </w:tcPr>
-          <w:p>
-            <w:pPr>
-              <w:pStyle w:val="Normal"/>
-              <w:widowControl/>
+            <w:tcW w:w="1333" w:type="dxa"/>
+            <w:tcBorders/>
+          </w:tcPr>
+          <w:p>
+            <w:pPr>
+              <w:pStyle w:val="Normal"/>
+              <w:widowControl/>
+              <w:suppressAutoHyphens w:val="true"/>
               <w:spacing w:lineRule="auto" w:line="240" w:before="0" w:after="0"/>
               <w:jc w:val="center"/>
               <w:rPr>
@@ -2682,6 +2762,7 @@
             <w:pPr>
               <w:pStyle w:val="Normal"/>
               <w:widowControl/>
+              <w:suppressAutoHyphens w:val="true"/>
               <w:spacing w:lineRule="auto" w:line="240" w:before="0" w:after="0"/>
               <w:jc w:val="center"/>
               <w:rPr>
@@ -2710,6 +2791,7 @@
             <w:pPr>
               <w:pStyle w:val="Normal"/>
               <w:widowControl/>
+              <w:suppressAutoHyphens w:val="true"/>
               <w:spacing w:lineRule="auto" w:line="240" w:before="0" w:after="0"/>
               <w:jc w:val="center"/>
               <w:rPr>
@@ -3056,6 +3138,7 @@
             <w:pPr>
               <w:pStyle w:val="Normal"/>
               <w:widowControl/>
+              <w:suppressAutoHyphens w:val="true"/>
               <w:spacing w:lineRule="auto" w:line="240" w:before="0" w:after="0"/>
               <w:jc w:val="start"/>
               <w:rPr>
@@ -3085,6 +3168,7 @@
             <w:pPr>
               <w:pStyle w:val="Normal"/>
               <w:widowControl/>
+              <w:suppressAutoHyphens w:val="true"/>
               <w:spacing w:lineRule="auto" w:line="240" w:before="0" w:after="0"/>
               <w:jc w:val="end"/>
               <w:rPr>
@@ -3117,6 +3201,7 @@
             <w:pPr>
               <w:pStyle w:val="Normal"/>
               <w:widowControl/>
+              <w:suppressAutoHyphens w:val="true"/>
               <w:spacing w:lineRule="auto" w:line="240" w:before="0" w:after="0"/>
               <w:jc w:val="start"/>
               <w:rPr>
@@ -3146,6 +3231,7 @@
             <w:pPr>
               <w:pStyle w:val="Normal"/>
               <w:widowControl/>
+              <w:suppressAutoHyphens w:val="true"/>
               <w:spacing w:lineRule="auto" w:line="240" w:before="0" w:after="0"/>
               <w:jc w:val="end"/>
               <w:rPr>
@@ -3178,6 +3264,7 @@
             <w:pPr>
               <w:pStyle w:val="Normal"/>
               <w:widowControl/>
+              <w:suppressAutoHyphens w:val="true"/>
               <w:spacing w:lineRule="auto" w:line="240" w:before="0" w:after="0"/>
               <w:jc w:val="start"/>
               <w:rPr>
@@ -3207,6 +3294,7 @@
             <w:pPr>
               <w:pStyle w:val="Normal"/>
               <w:widowControl/>
+              <w:suppressAutoHyphens w:val="true"/>
               <w:spacing w:lineRule="auto" w:line="240" w:before="0" w:after="0"/>
               <w:jc w:val="end"/>
               <w:rPr>
@@ -3239,6 +3327,7 @@
             <w:pPr>
               <w:pStyle w:val="Normal"/>
               <w:widowControl/>
+              <w:suppressAutoHyphens w:val="true"/>
               <w:spacing w:lineRule="auto" w:line="240" w:before="0" w:after="0"/>
               <w:jc w:val="start"/>
               <w:rPr>
@@ -3268,6 +3357,7 @@
             <w:pPr>
               <w:pStyle w:val="Normal"/>
               <w:widowControl/>
+              <w:suppressAutoHyphens w:val="true"/>
               <w:spacing w:lineRule="auto" w:line="240" w:before="0" w:after="0"/>
               <w:jc w:val="end"/>
               <w:rPr>
@@ -3300,6 +3390,7 @@
             <w:pPr>
               <w:pStyle w:val="Normal"/>
               <w:widowControl/>
+              <w:suppressAutoHyphens w:val="true"/>
               <w:spacing w:lineRule="auto" w:line="240" w:before="0" w:after="0"/>
               <w:jc w:val="start"/>
               <w:rPr>
@@ -3329,6 +3420,7 @@
             <w:pPr>
               <w:pStyle w:val="Normal"/>
               <w:widowControl/>
+              <w:suppressAutoHyphens w:val="true"/>
               <w:spacing w:lineRule="auto" w:line="240" w:before="0" w:after="0"/>
               <w:jc w:val="end"/>
               <w:rPr>
@@ -3361,6 +3453,7 @@
             <w:pPr>
               <w:pStyle w:val="Normal"/>
               <w:widowControl/>
+              <w:suppressAutoHyphens w:val="true"/>
               <w:spacing w:lineRule="auto" w:line="240" w:before="0" w:after="0"/>
               <w:jc w:val="start"/>
               <w:rPr>
@@ -3390,6 +3483,7 @@
             <w:pPr>
               <w:pStyle w:val="Normal"/>
               <w:widowControl/>
+              <w:suppressAutoHyphens w:val="true"/>
               <w:spacing w:lineRule="auto" w:line="240" w:before="0" w:after="0"/>
               <w:jc w:val="end"/>
               <w:rPr>
@@ -3463,6 +3557,7 @@
             <w:pPr>
               <w:pStyle w:val="Normal"/>
               <w:widowControl/>
+              <w:suppressAutoHyphens w:val="true"/>
               <w:spacing w:lineRule="auto" w:line="240" w:before="0" w:after="0"/>
               <w:jc w:val="start"/>
               <w:rPr>
@@ -3492,6 +3587,7 @@
             <w:pPr>
               <w:pStyle w:val="Normal"/>
               <w:widowControl/>
+              <w:suppressAutoHyphens w:val="true"/>
               <w:spacing w:lineRule="auto" w:line="240" w:before="0" w:after="0"/>
               <w:jc w:val="end"/>
               <w:rPr>
@@ -3524,6 +3620,7 @@
             <w:pPr>
               <w:pStyle w:val="Normal"/>
               <w:widowControl/>
+              <w:suppressAutoHyphens w:val="true"/>
               <w:spacing w:lineRule="auto" w:line="240" w:before="0" w:after="0"/>
               <w:jc w:val="start"/>
               <w:rPr>
@@ -3553,6 +3650,7 @@
             <w:pPr>
               <w:pStyle w:val="Normal"/>
               <w:widowControl/>
+              <w:suppressAutoHyphens w:val="true"/>
               <w:spacing w:lineRule="auto" w:line="240" w:before="0" w:after="0"/>
               <w:jc w:val="end"/>
               <w:rPr>
@@ -3585,6 +3683,7 @@
             <w:pPr>
               <w:pStyle w:val="Normal"/>
               <w:widowControl/>
+              <w:suppressAutoHyphens w:val="true"/>
               <w:spacing w:lineRule="auto" w:line="240" w:before="0" w:after="0"/>
               <w:jc w:val="start"/>
               <w:rPr>
@@ -3614,6 +3713,7 @@
             <w:pPr>
               <w:pStyle w:val="Normal"/>
               <w:widowControl/>
+              <w:suppressAutoHyphens w:val="true"/>
               <w:spacing w:lineRule="auto" w:line="240" w:before="0" w:after="0"/>
               <w:jc w:val="end"/>
               <w:rPr>
@@ -3646,6 +3746,7 @@
             <w:pPr>
               <w:pStyle w:val="Normal"/>
               <w:widowControl/>
+              <w:suppressAutoHyphens w:val="true"/>
               <w:spacing w:lineRule="auto" w:line="240" w:before="0" w:after="0"/>
               <w:jc w:val="start"/>
               <w:rPr>
@@ -3675,6 +3776,7 @@
             <w:pPr>
               <w:pStyle w:val="Normal"/>
               <w:widowControl/>
+              <w:suppressAutoHyphens w:val="true"/>
               <w:spacing w:lineRule="auto" w:line="240" w:before="0" w:after="0"/>
               <w:jc w:val="end"/>
               <w:rPr>
@@ -3707,6 +3809,7 @@
             <w:pPr>
               <w:pStyle w:val="Normal"/>
               <w:widowControl/>
+              <w:suppressAutoHyphens w:val="true"/>
               <w:spacing w:lineRule="auto" w:line="240" w:before="0" w:after="0"/>
               <w:jc w:val="start"/>
               <w:rPr>
@@ -3736,6 +3839,7 @@
             <w:pPr>
               <w:pStyle w:val="Normal"/>
               <w:widowControl/>
+              <w:suppressAutoHyphens w:val="true"/>
               <w:spacing w:lineRule="auto" w:line="240" w:before="0" w:after="0"/>
               <w:jc w:val="end"/>
               <w:rPr>
@@ -3768,6 +3872,7 @@
             <w:pPr>
               <w:pStyle w:val="Normal"/>
               <w:widowControl/>
+              <w:suppressAutoHyphens w:val="true"/>
               <w:spacing w:lineRule="auto" w:line="240" w:before="0" w:after="0"/>
               <w:jc w:val="start"/>
               <w:rPr>
@@ -3797,6 +3902,7 @@
             <w:pPr>
               <w:pStyle w:val="Normal"/>
               <w:widowControl/>
+              <w:suppressAutoHyphens w:val="true"/>
               <w:spacing w:lineRule="auto" w:line="240" w:before="0" w:after="0"/>
               <w:jc w:val="end"/>
               <w:rPr>
@@ -3870,6 +3976,7 @@
             <w:pPr>
               <w:pStyle w:val="Normal"/>
               <w:widowControl/>
+              <w:suppressAutoHyphens w:val="true"/>
               <w:spacing w:lineRule="auto" w:line="240" w:before="0" w:after="0"/>
               <w:jc w:val="start"/>
               <w:rPr>
@@ -3899,6 +4006,7 @@
             <w:pPr>
               <w:pStyle w:val="Normal"/>
               <w:widowControl/>
+              <w:suppressAutoHyphens w:val="true"/>
               <w:spacing w:lineRule="auto" w:line="240" w:before="0" w:after="0"/>
               <w:jc w:val="end"/>
               <w:rPr>
@@ -3931,6 +4039,7 @@
             <w:pPr>
               <w:pStyle w:val="Normal"/>
               <w:widowControl/>
+              <w:suppressAutoHyphens w:val="true"/>
               <w:spacing w:lineRule="auto" w:line="240" w:before="0" w:after="0"/>
               <w:jc w:val="start"/>
               <w:rPr>
@@ -3960,6 +4069,7 @@
             <w:pPr>
               <w:pStyle w:val="Normal"/>
               <w:widowControl/>
+              <w:suppressAutoHyphens w:val="true"/>
               <w:spacing w:lineRule="auto" w:line="240" w:before="0" w:after="0"/>
               <w:jc w:val="end"/>
               <w:rPr>
@@ -3992,6 +4102,7 @@
             <w:pPr>
               <w:pStyle w:val="Normal"/>
               <w:widowControl/>
+              <w:suppressAutoHyphens w:val="true"/>
               <w:spacing w:lineRule="auto" w:line="240" w:before="0" w:after="0"/>
               <w:jc w:val="start"/>
               <w:rPr>
@@ -4021,6 +4132,7 @@
             <w:pPr>
               <w:pStyle w:val="Normal"/>
               <w:widowControl/>
+              <w:suppressAutoHyphens w:val="true"/>
               <w:spacing w:lineRule="auto" w:line="240" w:before="0" w:after="0"/>
               <w:jc w:val="end"/>
               <w:rPr>
@@ -4053,6 +4165,7 @@
             <w:pPr>
               <w:pStyle w:val="Normal"/>
               <w:widowControl/>
+              <w:suppressAutoHyphens w:val="true"/>
               <w:spacing w:lineRule="auto" w:line="240" w:before="0" w:after="0"/>
               <w:jc w:val="start"/>
               <w:rPr>
@@ -4082,6 +4195,7 @@
             <w:pPr>
               <w:pStyle w:val="Normal"/>
               <w:widowControl/>
+              <w:suppressAutoHyphens w:val="true"/>
               <w:spacing w:lineRule="auto" w:line="240" w:before="0" w:after="0"/>
               <w:jc w:val="end"/>
               <w:rPr>
@@ -4155,6 +4269,7 @@
             <w:pPr>
               <w:pStyle w:val="Normal"/>
               <w:widowControl/>
+              <w:suppressAutoHyphens w:val="true"/>
               <w:spacing w:lineRule="auto" w:line="240" w:before="0" w:after="0"/>
               <w:jc w:val="start"/>
               <w:rPr>
@@ -4184,6 +4299,7 @@
             <w:pPr>
               <w:pStyle w:val="Normal"/>
               <w:widowControl/>
+              <w:suppressAutoHyphens w:val="true"/>
               <w:spacing w:lineRule="auto" w:line="240" w:before="0" w:after="0"/>
               <w:jc w:val="end"/>
               <w:rPr>
@@ -4216,6 +4332,7 @@
             <w:pPr>
               <w:pStyle w:val="Normal"/>
               <w:widowControl/>
+              <w:suppressAutoHyphens w:val="true"/>
               <w:spacing w:lineRule="auto" w:line="240" w:before="0" w:after="0"/>
               <w:jc w:val="start"/>
               <w:rPr>
@@ -4245,6 +4362,7 @@
             <w:pPr>
               <w:pStyle w:val="Normal"/>
               <w:widowControl/>
+              <w:suppressAutoHyphens w:val="true"/>
               <w:spacing w:lineRule="auto" w:line="240" w:before="0" w:after="0"/>
               <w:jc w:val="end"/>
               <w:rPr>
@@ -4277,6 +4395,7 @@
             <w:pPr>
               <w:pStyle w:val="Normal"/>
               <w:widowControl/>
+              <w:suppressAutoHyphens w:val="true"/>
               <w:spacing w:lineRule="auto" w:line="240" w:before="0" w:after="0"/>
               <w:jc w:val="start"/>
               <w:rPr>
@@ -4306,6 +4425,7 @@
             <w:pPr>
               <w:pStyle w:val="Normal"/>
               <w:widowControl/>
+              <w:suppressAutoHyphens w:val="true"/>
               <w:spacing w:lineRule="auto" w:line="240" w:before="0" w:after="0"/>
               <w:jc w:val="end"/>
               <w:rPr>
@@ -4338,6 +4458,7 @@
             <w:pPr>
               <w:pStyle w:val="Normal"/>
               <w:widowControl/>
+              <w:suppressAutoHyphens w:val="true"/>
               <w:spacing w:lineRule="auto" w:line="240" w:before="0" w:after="0"/>
               <w:jc w:val="start"/>
               <w:rPr>
@@ -4367,6 +4488,7 @@
             <w:pPr>
               <w:pStyle w:val="Normal"/>
               <w:widowControl/>
+              <w:suppressAutoHyphens w:val="true"/>
               <w:spacing w:lineRule="auto" w:line="240" w:before="0" w:after="0"/>
               <w:jc w:val="end"/>
               <w:rPr>
@@ -4399,6 +4521,7 @@
             <w:pPr>
               <w:pStyle w:val="Normal"/>
               <w:widowControl/>
+              <w:suppressAutoHyphens w:val="true"/>
               <w:spacing w:lineRule="auto" w:line="240" w:before="0" w:after="0"/>
               <w:jc w:val="start"/>
               <w:rPr>
@@ -4428,6 +4551,7 @@
             <w:pPr>
               <w:pStyle w:val="Normal"/>
               <w:widowControl/>
+              <w:suppressAutoHyphens w:val="true"/>
               <w:spacing w:lineRule="auto" w:line="240" w:before="0" w:after="0"/>
               <w:jc w:val="end"/>
               <w:rPr>
@@ -4501,6 +4625,7 @@
             <w:pPr>
               <w:pStyle w:val="Normal"/>
               <w:widowControl/>
+              <w:suppressAutoHyphens w:val="true"/>
               <w:spacing w:lineRule="auto" w:line="240" w:before="0" w:after="0"/>
               <w:jc w:val="start"/>
               <w:rPr>
@@ -4530,6 +4655,7 @@
             <w:pPr>
               <w:pStyle w:val="Normal"/>
               <w:widowControl/>
+              <w:suppressAutoHyphens w:val="true"/>
               <w:spacing w:lineRule="auto" w:line="240" w:before="0" w:after="0"/>
               <w:jc w:val="end"/>
               <w:rPr>
@@ -4572,6 +4698,7 @@
             <w:pPr>
               <w:pStyle w:val="Normal"/>
               <w:widowControl/>
+              <w:suppressAutoHyphens w:val="true"/>
               <w:spacing w:lineRule="auto" w:line="240" w:before="0" w:after="0"/>
               <w:jc w:val="start"/>
               <w:rPr>
@@ -4601,6 +4728,7 @@
             <w:pPr>
               <w:pStyle w:val="Normal"/>
               <w:widowControl/>
+              <w:suppressAutoHyphens w:val="true"/>
               <w:spacing w:lineRule="auto" w:line="240" w:before="0" w:after="0"/>
               <w:jc w:val="end"/>
               <w:rPr>
@@ -4633,6 +4761,7 @@
             <w:pPr>
               <w:pStyle w:val="Normal"/>
               <w:widowControl/>
+              <w:suppressAutoHyphens w:val="true"/>
               <w:spacing w:lineRule="auto" w:line="240" w:before="0" w:after="0"/>
               <w:jc w:val="start"/>
               <w:rPr>
@@ -4662,6 +4791,7 @@
             <w:pPr>
               <w:pStyle w:val="Normal"/>
               <w:widowControl/>
+              <w:suppressAutoHyphens w:val="true"/>
               <w:spacing w:lineRule="auto" w:line="240" w:before="0" w:after="0"/>
               <w:jc w:val="end"/>
               <w:rPr>
@@ -4694,6 +4824,7 @@
             <w:pPr>
               <w:pStyle w:val="Normal"/>
               <w:widowControl/>
+              <w:suppressAutoHyphens w:val="true"/>
               <w:spacing w:lineRule="auto" w:line="240" w:before="0" w:after="0"/>
               <w:jc w:val="start"/>
               <w:rPr>
@@ -4723,6 +4854,7 @@
             <w:pPr>
               <w:pStyle w:val="Normal"/>
               <w:widowControl/>
+              <w:suppressAutoHyphens w:val="true"/>
               <w:spacing w:lineRule="auto" w:line="240" w:before="0" w:after="0"/>
               <w:jc w:val="end"/>
               <w:rPr>
@@ -4755,6 +4887,7 @@
             <w:pPr>
               <w:pStyle w:val="Normal"/>
               <w:widowControl/>
+              <w:suppressAutoHyphens w:val="true"/>
               <w:spacing w:lineRule="auto" w:line="240" w:before="0" w:after="0"/>
               <w:jc w:val="start"/>
               <w:rPr>
@@ -4784,6 +4917,7 @@
             <w:pPr>
               <w:pStyle w:val="Normal"/>
               <w:widowControl/>
+              <w:suppressAutoHyphens w:val="true"/>
               <w:spacing w:lineRule="auto" w:line="240" w:before="0" w:after="0"/>
               <w:jc w:val="end"/>
               <w:rPr>
@@ -4816,6 +4950,7 @@
             <w:pPr>
               <w:pStyle w:val="Normal"/>
               <w:widowControl/>
+              <w:suppressAutoHyphens w:val="true"/>
               <w:spacing w:lineRule="auto" w:line="240" w:before="0" w:after="0"/>
               <w:jc w:val="start"/>
               <w:rPr>
@@ -4845,6 +4980,7 @@
             <w:pPr>
               <w:pStyle w:val="Normal"/>
               <w:widowControl/>
+              <w:suppressAutoHyphens w:val="true"/>
               <w:spacing w:lineRule="auto" w:line="240" w:before="0" w:after="0"/>
               <w:jc w:val="end"/>
               <w:rPr>
@@ -4877,6 +5013,7 @@
             <w:pPr>
               <w:pStyle w:val="Normal"/>
               <w:widowControl/>
+              <w:suppressAutoHyphens w:val="true"/>
               <w:spacing w:lineRule="auto" w:line="240" w:before="0" w:after="0"/>
               <w:jc w:val="start"/>
               <w:rPr>
@@ -4906,6 +5043,7 @@
             <w:pPr>
               <w:pStyle w:val="Normal"/>
               <w:widowControl/>
+              <w:suppressAutoHyphens w:val="true"/>
               <w:spacing w:lineRule="auto" w:line="240" w:before="0" w:after="0"/>
               <w:jc w:val="end"/>
               <w:rPr>
@@ -4938,6 +5076,7 @@
             <w:pPr>
               <w:pStyle w:val="Normal"/>
               <w:widowControl/>
+              <w:suppressAutoHyphens w:val="true"/>
               <w:spacing w:lineRule="auto" w:line="240" w:before="0" w:after="0"/>
               <w:jc w:val="start"/>
               <w:rPr>
@@ -4967,6 +5106,7 @@
             <w:pPr>
               <w:pStyle w:val="Normal"/>
               <w:widowControl/>
+              <w:suppressAutoHyphens w:val="true"/>
               <w:spacing w:lineRule="auto" w:line="240" w:before="0" w:after="0"/>
               <w:jc w:val="end"/>
               <w:rPr>
@@ -5040,6 +5180,7 @@
             <w:pPr>
               <w:pStyle w:val="Normal"/>
               <w:widowControl/>
+              <w:suppressAutoHyphens w:val="true"/>
               <w:spacing w:lineRule="auto" w:line="240" w:before="0" w:after="0"/>
               <w:jc w:val="start"/>
               <w:rPr>
@@ -5069,6 +5210,7 @@
             <w:pPr>
               <w:pStyle w:val="Normal"/>
               <w:widowControl/>
+              <w:suppressAutoHyphens w:val="true"/>
               <w:spacing w:lineRule="auto" w:line="240" w:before="0" w:after="0"/>
               <w:jc w:val="end"/>
               <w:rPr>
@@ -5102,6 +5244,7 @@
             <w:pPr>
               <w:pStyle w:val="Normal"/>
               <w:widowControl/>
+              <w:suppressAutoHyphens w:val="true"/>
               <w:spacing w:lineRule="auto" w:line="240" w:before="0" w:after="0"/>
               <w:jc w:val="end"/>
               <w:rPr>
@@ -5134,6 +5277,7 @@
             <w:pPr>
               <w:pStyle w:val="Normal"/>
               <w:widowControl/>
+              <w:suppressAutoHyphens w:val="true"/>
               <w:spacing w:lineRule="auto" w:line="240" w:before="0" w:after="0"/>
               <w:jc w:val="start"/>
               <w:rPr>
@@ -5163,6 +5307,7 @@
             <w:pPr>
               <w:pStyle w:val="Normal"/>
               <w:widowControl/>
+              <w:suppressAutoHyphens w:val="true"/>
               <w:spacing w:lineRule="auto" w:line="240" w:before="0" w:after="0"/>
               <w:jc w:val="end"/>
               <w:rPr>
@@ -5195,6 +5340,7 @@
             <w:pPr>
               <w:pStyle w:val="Normal"/>
               <w:widowControl/>
+              <w:suppressAutoHyphens w:val="true"/>
               <w:spacing w:lineRule="auto" w:line="240" w:before="0" w:after="0"/>
               <w:jc w:val="start"/>
               <w:rPr>
@@ -5224,6 +5370,7 @@
             <w:pPr>
               <w:pStyle w:val="Normal"/>
               <w:widowControl/>
+              <w:suppressAutoHyphens w:val="true"/>
               <w:spacing w:lineRule="auto" w:line="240" w:before="0" w:after="0"/>
               <w:jc w:val="end"/>
               <w:rPr>
@@ -5377,6 +5524,7 @@
             <w:pPr>
               <w:pStyle w:val="Normal"/>
               <w:widowControl/>
+              <w:suppressAutoHyphens w:val="true"/>
               <w:spacing w:lineRule="auto" w:line="240" w:before="0" w:after="0"/>
               <w:jc w:val="start"/>
               <w:rPr>
@@ -5406,6 +5554,7 @@
             <w:pPr>
               <w:pStyle w:val="Normal"/>
               <w:widowControl/>
+              <w:suppressAutoHyphens w:val="true"/>
               <w:spacing w:lineRule="auto" w:line="240" w:before="0" w:after="0"/>
               <w:jc w:val="end"/>
               <w:rPr>
@@ -5448,6 +5597,7 @@
             <w:pPr>
               <w:pStyle w:val="Normal"/>
               <w:widowControl/>
+              <w:suppressAutoHyphens w:val="true"/>
               <w:spacing w:lineRule="auto" w:line="240" w:before="0" w:after="0"/>
               <w:jc w:val="start"/>
               <w:rPr>
@@ -5477,6 +5627,7 @@
             <w:pPr>
               <w:pStyle w:val="Normal"/>
               <w:widowControl/>
+              <w:suppressAutoHyphens w:val="true"/>
               <w:spacing w:lineRule="auto" w:line="240" w:before="0" w:after="0"/>
               <w:jc w:val="end"/>
               <w:rPr>
@@ -5509,6 +5660,7 @@
             <w:pPr>
               <w:pStyle w:val="Normal"/>
               <w:widowControl/>
+              <w:suppressAutoHyphens w:val="true"/>
               <w:spacing w:lineRule="auto" w:line="240" w:before="0" w:after="0"/>
               <w:jc w:val="start"/>
               <w:rPr>
@@ -5538,6 +5690,7 @@
             <w:pPr>
               <w:pStyle w:val="Normal"/>
               <w:widowControl/>
+              <w:suppressAutoHyphens w:val="true"/>
               <w:spacing w:lineRule="auto" w:line="240" w:before="0" w:after="0"/>
               <w:jc w:val="end"/>
               <w:rPr>
@@ -5570,6 +5723,7 @@
             <w:pPr>
               <w:pStyle w:val="Normal"/>
               <w:widowControl/>
+              <w:suppressAutoHyphens w:val="true"/>
               <w:spacing w:lineRule="auto" w:line="240" w:before="0" w:after="0"/>
               <w:jc w:val="start"/>
               <w:rPr>
@@ -5599,6 +5753,7 @@
             <w:pPr>
               <w:pStyle w:val="Normal"/>
               <w:widowControl/>
+              <w:suppressAutoHyphens w:val="true"/>
               <w:spacing w:lineRule="auto" w:line="240" w:before="0" w:after="0"/>
               <w:jc w:val="end"/>
               <w:rPr>
@@ -5631,6 +5786,7 @@
             <w:pPr>
               <w:pStyle w:val="Normal"/>
               <w:widowControl/>
+              <w:suppressAutoHyphens w:val="true"/>
               <w:spacing w:lineRule="auto" w:line="240" w:before="0" w:after="0"/>
               <w:jc w:val="start"/>
               <w:rPr>
@@ -5660,6 +5816,7 @@
             <w:pPr>
               <w:pStyle w:val="Normal"/>
               <w:widowControl/>
+              <w:suppressAutoHyphens w:val="true"/>
               <w:spacing w:lineRule="auto" w:line="240" w:before="0" w:after="0"/>
               <w:jc w:val="end"/>
               <w:rPr>
@@ -5692,6 +5849,7 @@
             <w:pPr>
               <w:pStyle w:val="Normal"/>
               <w:widowControl/>
+              <w:suppressAutoHyphens w:val="true"/>
               <w:spacing w:lineRule="auto" w:line="240" w:before="0" w:after="0"/>
               <w:jc w:val="start"/>
               <w:rPr>
@@ -5721,6 +5879,7 @@
             <w:pPr>
               <w:pStyle w:val="Normal"/>
               <w:widowControl/>
+              <w:suppressAutoHyphens w:val="true"/>
               <w:spacing w:lineRule="auto" w:line="240" w:before="0" w:after="0"/>
               <w:jc w:val="end"/>
               <w:rPr>
@@ -5794,6 +5953,7 @@
             <w:pPr>
               <w:pStyle w:val="Normal"/>
               <w:widowControl/>
+              <w:suppressAutoHyphens w:val="true"/>
               <w:spacing w:lineRule="auto" w:line="240" w:before="0" w:after="0"/>
               <w:jc w:val="start"/>
               <w:rPr>
@@ -5823,6 +5983,7 @@
             <w:pPr>
               <w:pStyle w:val="Normal"/>
               <w:widowControl/>
+              <w:suppressAutoHyphens w:val="true"/>
               <w:spacing w:lineRule="auto" w:line="240" w:before="0" w:after="0"/>
               <w:jc w:val="end"/>
               <w:rPr>
@@ -5833,11 +5994,9 @@
             </w:pPr>
             <w:r>
               <w:rPr>
-                <w:rFonts w:eastAsia="Calibri" w:cs="Arial" w:ascii="Arial" w:hAnsi="Arial"/>
-                <w:kern w:val="0"/>
-                <w:sz w:val="20"/>
-                <w:szCs w:val="20"/>
-                <w:lang w:val="pt-BR" w:eastAsia="en-US" w:bidi="ar-SA"/>
+                <w:rFonts w:cs="Arial" w:ascii="Arial" w:hAnsi="Arial"/>
+                <w:sz w:val="20"/>
+                <w:szCs w:val="20"/>
               </w:rPr>
             </w:r>
           </w:p>
@@ -5854,6 +6013,7 @@
             <w:pPr>
               <w:pStyle w:val="Normal"/>
               <w:widowControl/>
+              <w:suppressAutoHyphens w:val="true"/>
               <w:spacing w:lineRule="auto" w:line="240" w:before="0" w:after="0"/>
               <w:jc w:val="start"/>
               <w:rPr>
@@ -5893,6 +6053,7 @@
             <w:pPr>
               <w:pStyle w:val="Normal"/>
               <w:widowControl/>
+              <w:suppressAutoHyphens w:val="true"/>
               <w:spacing w:lineRule="auto" w:line="240" w:before="0" w:after="0"/>
               <w:jc w:val="end"/>
               <w:rPr>
@@ -5925,6 +6086,7 @@
             <w:pPr>
               <w:pStyle w:val="Normal"/>
               <w:widowControl/>
+              <w:suppressAutoHyphens w:val="true"/>
               <w:spacing w:lineRule="auto" w:line="240" w:before="0" w:after="0"/>
               <w:jc w:val="start"/>
               <w:rPr>
@@ -5964,6 +6126,7 @@
             <w:pPr>
               <w:pStyle w:val="Normal"/>
               <w:widowControl/>
+              <w:suppressAutoHyphens w:val="true"/>
               <w:spacing w:lineRule="auto" w:line="240" w:before="0" w:after="0"/>
               <w:jc w:val="end"/>
               <w:rPr>
@@ -5996,6 +6159,7 @@
             <w:pPr>
               <w:pStyle w:val="Normal"/>
               <w:widowControl/>
+              <w:suppressAutoHyphens w:val="true"/>
               <w:spacing w:lineRule="auto" w:line="240" w:before="0" w:after="0"/>
               <w:jc w:val="start"/>
               <w:rPr>
@@ -6035,6 +6199,7 @@
             <w:pPr>
               <w:pStyle w:val="Normal"/>
               <w:widowControl/>
+              <w:suppressAutoHyphens w:val="true"/>
               <w:spacing w:lineRule="auto" w:line="240" w:before="0" w:after="0"/>
               <w:jc w:val="end"/>
               <w:rPr>
@@ -6067,6 +6232,7 @@
             <w:pPr>
               <w:pStyle w:val="Normal"/>
               <w:widowControl/>
+              <w:suppressAutoHyphens w:val="true"/>
               <w:spacing w:lineRule="auto" w:line="240" w:before="0" w:after="0"/>
               <w:jc w:val="start"/>
               <w:rPr>
@@ -6106,6 +6272,7 @@
             <w:pPr>
               <w:pStyle w:val="Normal"/>
               <w:widowControl/>
+              <w:suppressAutoHyphens w:val="true"/>
               <w:spacing w:lineRule="auto" w:line="240" w:before="0" w:after="0"/>
               <w:jc w:val="end"/>
               <w:rPr>
@@ -6138,6 +6305,7 @@
             <w:pPr>
               <w:pStyle w:val="Normal"/>
               <w:widowControl/>
+              <w:suppressAutoHyphens w:val="true"/>
               <w:spacing w:lineRule="auto" w:line="240" w:before="0" w:after="0"/>
               <w:jc w:val="start"/>
               <w:rPr>
@@ -6167,6 +6335,7 @@
             <w:pPr>
               <w:pStyle w:val="Normal"/>
               <w:widowControl/>
+              <w:suppressAutoHyphens w:val="true"/>
               <w:spacing w:lineRule="auto" w:line="240" w:before="0" w:after="0"/>
               <w:jc w:val="end"/>
               <w:rPr>
@@ -6177,11 +6346,9 @@
             </w:pPr>
             <w:r>
               <w:rPr>
-                <w:rFonts w:eastAsia="Calibri" w:cs="Arial" w:ascii="Arial" w:hAnsi="Arial"/>
-                <w:kern w:val="0"/>
-                <w:sz w:val="20"/>
-                <w:szCs w:val="20"/>
-                <w:lang w:val="pt-BR" w:eastAsia="en-US" w:bidi="ar-SA"/>
+                <w:rFonts w:cs="Arial" w:ascii="Arial" w:hAnsi="Arial"/>
+                <w:sz w:val="20"/>
+                <w:szCs w:val="20"/>
               </w:rPr>
             </w:r>
           </w:p>
@@ -6198,6 +6365,7 @@
             <w:pPr>
               <w:pStyle w:val="Normal"/>
               <w:widowControl/>
+              <w:suppressAutoHyphens w:val="true"/>
               <w:spacing w:lineRule="auto" w:line="240" w:before="0" w:after="0"/>
               <w:jc w:val="start"/>
               <w:rPr>
@@ -6237,6 +6405,7 @@
             <w:pPr>
               <w:pStyle w:val="Normal"/>
               <w:widowControl/>
+              <w:suppressAutoHyphens w:val="true"/>
               <w:spacing w:lineRule="auto" w:line="240" w:before="0" w:after="0"/>
               <w:jc w:val="end"/>
               <w:rPr>
@@ -6269,6 +6438,7 @@
             <w:pPr>
               <w:pStyle w:val="Normal"/>
               <w:widowControl/>
+              <w:suppressAutoHyphens w:val="true"/>
               <w:spacing w:lineRule="auto" w:line="240" w:before="0" w:after="0"/>
               <w:jc w:val="start"/>
               <w:rPr>
@@ -6308,6 +6478,7 @@
             <w:pPr>
               <w:pStyle w:val="Normal"/>
               <w:widowControl/>
+              <w:suppressAutoHyphens w:val="true"/>
               <w:spacing w:lineRule="auto" w:line="240" w:before="0" w:after="0"/>
               <w:jc w:val="end"/>
               <w:rPr>
@@ -6340,6 +6511,7 @@
             <w:pPr>
               <w:pStyle w:val="Normal"/>
               <w:widowControl/>
+              <w:suppressAutoHyphens w:val="true"/>
               <w:spacing w:lineRule="auto" w:line="240" w:before="0" w:after="0"/>
               <w:jc w:val="start"/>
               <w:rPr>
@@ -6379,6 +6551,7 @@
             <w:pPr>
               <w:pStyle w:val="Normal"/>
               <w:widowControl/>
+              <w:suppressAutoHyphens w:val="true"/>
               <w:spacing w:lineRule="auto" w:line="240" w:before="0" w:after="0"/>
               <w:jc w:val="end"/>
               <w:rPr>
@@ -6411,6 +6584,7 @@
             <w:pPr>
               <w:pStyle w:val="Normal"/>
               <w:widowControl/>
+              <w:suppressAutoHyphens w:val="true"/>
               <w:spacing w:lineRule="auto" w:line="240" w:before="0" w:after="0"/>
               <w:jc w:val="start"/>
               <w:rPr>
@@ -6440,6 +6614,7 @@
             <w:pPr>
               <w:pStyle w:val="Normal"/>
               <w:widowControl/>
+              <w:suppressAutoHyphens w:val="true"/>
               <w:spacing w:lineRule="auto" w:line="240" w:before="0" w:after="0"/>
               <w:jc w:val="end"/>
               <w:rPr>
@@ -6472,6 +6647,7 @@
             <w:pPr>
               <w:pStyle w:val="Normal"/>
               <w:widowControl/>
+              <w:suppressAutoHyphens w:val="true"/>
               <w:spacing w:lineRule="auto" w:line="240" w:before="0" w:after="0"/>
               <w:jc w:val="start"/>
               <w:rPr>
@@ -6501,6 +6677,7 @@
             <w:pPr>
               <w:pStyle w:val="Normal"/>
               <w:widowControl/>
+              <w:suppressAutoHyphens w:val="true"/>
               <w:spacing w:lineRule="auto" w:line="240" w:before="0" w:after="0"/>
               <w:jc w:val="end"/>
               <w:rPr>
@@ -6533,6 +6710,7 @@
             <w:pPr>
               <w:pStyle w:val="Normal"/>
               <w:widowControl/>
+              <w:suppressAutoHyphens w:val="true"/>
               <w:spacing w:lineRule="auto" w:line="240" w:before="0" w:after="0"/>
               <w:jc w:val="start"/>
               <w:rPr>
@@ -6562,6 +6740,7 @@
             <w:pPr>
               <w:pStyle w:val="Normal"/>
               <w:widowControl/>
+              <w:suppressAutoHyphens w:val="true"/>
               <w:spacing w:lineRule="auto" w:line="240" w:before="0" w:after="0"/>
               <w:jc w:val="end"/>
               <w:rPr>
@@ -6616,6 +6795,7 @@
             <w:pPr>
               <w:pStyle w:val="Normal"/>
               <w:widowControl/>
+              <w:suppressAutoHyphens w:val="true"/>
               <w:spacing w:lineRule="auto" w:line="240" w:before="0" w:after="0"/>
               <w:jc w:val="start"/>
               <w:rPr>
@@ -6645,6 +6825,7 @@
             <w:pPr>
               <w:pStyle w:val="Normal"/>
               <w:widowControl/>
+              <w:suppressAutoHyphens w:val="true"/>
               <w:spacing w:lineRule="auto" w:line="240" w:before="0" w:after="0"/>
               <w:jc w:val="end"/>
               <w:rPr>
@@ -6718,6 +6899,7 @@
             <w:pPr>
               <w:pStyle w:val="Normal"/>
               <w:widowControl/>
+              <w:suppressAutoHyphens w:val="true"/>
               <w:spacing w:lineRule="auto" w:line="240" w:before="0" w:after="0"/>
               <w:jc w:val="start"/>
               <w:rPr>
@@ -6747,6 +6929,7 @@
             <w:pPr>
               <w:pStyle w:val="Normal"/>
               <w:widowControl/>
+              <w:suppressAutoHyphens w:val="true"/>
               <w:spacing w:lineRule="auto" w:line="240" w:before="0" w:after="0"/>
               <w:jc w:val="end"/>
               <w:rPr>
@@ -6779,6 +6962,7 @@
             <w:pPr>
               <w:pStyle w:val="Normal"/>
               <w:widowControl/>
+              <w:suppressAutoHyphens w:val="true"/>
               <w:spacing w:lineRule="auto" w:line="240" w:before="0" w:after="0"/>
               <w:jc w:val="start"/>
               <w:rPr>
@@ -6808,6 +6992,7 @@
             <w:pPr>
               <w:pStyle w:val="Normal"/>
               <w:widowControl/>
+              <w:suppressAutoHyphens w:val="true"/>
               <w:spacing w:lineRule="auto" w:line="240" w:before="0" w:after="0"/>
               <w:jc w:val="end"/>
               <w:rPr>
@@ -6840,6 +7025,7 @@
             <w:pPr>
               <w:pStyle w:val="Normal"/>
               <w:widowControl/>
+              <w:suppressAutoHyphens w:val="true"/>
               <w:spacing w:lineRule="auto" w:line="240" w:before="0" w:after="0"/>
               <w:jc w:val="start"/>
               <w:rPr>
@@ -6869,6 +7055,7 @@
             <w:pPr>
               <w:pStyle w:val="Normal"/>
               <w:widowControl/>
+              <w:suppressAutoHyphens w:val="true"/>
               <w:spacing w:lineRule="auto" w:line="240" w:before="0" w:after="0"/>
               <w:jc w:val="end"/>
               <w:rPr>
@@ -6901,6 +7088,7 @@
             <w:pPr>
               <w:pStyle w:val="Normal"/>
               <w:widowControl/>
+              <w:suppressAutoHyphens w:val="true"/>
               <w:spacing w:lineRule="auto" w:line="240" w:before="0" w:after="0"/>
               <w:jc w:val="start"/>
               <w:rPr>
@@ -6930,6 +7118,7 @@
             <w:pPr>
               <w:pStyle w:val="Normal"/>
               <w:widowControl/>
+              <w:suppressAutoHyphens w:val="true"/>
               <w:spacing w:lineRule="auto" w:line="240" w:before="0" w:after="0"/>
               <w:jc w:val="end"/>
               <w:rPr>
@@ -6962,6 +7151,7 @@
             <w:pPr>
               <w:pStyle w:val="Normal"/>
               <w:widowControl/>
+              <w:suppressAutoHyphens w:val="true"/>
               <w:spacing w:lineRule="auto" w:line="240" w:before="0" w:after="0"/>
               <w:jc w:val="start"/>
               <w:rPr>
@@ -7001,6 +7191,7 @@
             <w:pPr>
               <w:pStyle w:val="Normal"/>
               <w:widowControl/>
+              <w:suppressAutoHyphens w:val="true"/>
               <w:spacing w:lineRule="auto" w:line="240" w:before="0" w:after="0"/>
               <w:jc w:val="end"/>
               <w:rPr>
@@ -7060,20 +7251,21 @@
         <w:tblLook w:val="04a0" w:firstRow="1" w:noVBand="1" w:lastRow="0" w:firstColumn="1" w:lastColumn="0" w:noHBand="0"/>
       </w:tblPr>
       <w:tblGrid>
-        <w:gridCol w:w="1301"/>
-        <w:gridCol w:w="962"/>
+        <w:gridCol w:w="1300"/>
+        <w:gridCol w:w="963"/>
       </w:tblGrid>
       <w:tr>
         <w:trPr/>
         <w:tc>
           <w:tcPr>
-            <w:tcW w:w="1301" w:type="dxa"/>
-            <w:tcBorders/>
-          </w:tcPr>
-          <w:p>
-            <w:pPr>
-              <w:pStyle w:val="Normal"/>
-              <w:widowControl/>
+            <w:tcW w:w="1300" w:type="dxa"/>
+            <w:tcBorders/>
+          </w:tcPr>
+          <w:p>
+            <w:pPr>
+              <w:pStyle w:val="Normal"/>
+              <w:widowControl/>
+              <w:suppressAutoHyphens w:val="true"/>
               <w:spacing w:lineRule="auto" w:line="240" w:before="0" w:after="0"/>
               <w:jc w:val="start"/>
               <w:rPr>
@@ -7096,13 +7288,14 @@
         </w:tc>
         <w:tc>
           <w:tcPr>
-            <w:tcW w:w="962" w:type="dxa"/>
-            <w:tcBorders/>
-          </w:tcPr>
-          <w:p>
-            <w:pPr>
-              <w:pStyle w:val="Normal"/>
-              <w:widowControl/>
+            <w:tcW w:w="963" w:type="dxa"/>
+            <w:tcBorders/>
+          </w:tcPr>
+          <w:p>
+            <w:pPr>
+              <w:pStyle w:val="Normal"/>
+              <w:widowControl/>
+              <w:suppressAutoHyphens w:val="true"/>
               <w:spacing w:lineRule="auto" w:line="240" w:before="0" w:after="0"/>
               <w:jc w:val="end"/>
               <w:rPr>
@@ -7128,13 +7321,14 @@
         <w:trPr/>
         <w:tc>
           <w:tcPr>
-            <w:tcW w:w="1301" w:type="dxa"/>
-            <w:tcBorders/>
-          </w:tcPr>
-          <w:p>
-            <w:pPr>
-              <w:pStyle w:val="Normal"/>
-              <w:widowControl/>
+            <w:tcW w:w="1300" w:type="dxa"/>
+            <w:tcBorders/>
+          </w:tcPr>
+          <w:p>
+            <w:pPr>
+              <w:pStyle w:val="Normal"/>
+              <w:widowControl/>
+              <w:suppressAutoHyphens w:val="true"/>
               <w:spacing w:lineRule="auto" w:line="240" w:before="0" w:after="0"/>
               <w:jc w:val="start"/>
               <w:rPr>
@@ -7157,13 +7351,14 @@
         </w:tc>
         <w:tc>
           <w:tcPr>
-            <w:tcW w:w="962" w:type="dxa"/>
-            <w:tcBorders/>
-          </w:tcPr>
-          <w:p>
-            <w:pPr>
-              <w:pStyle w:val="Normal"/>
-              <w:widowControl/>
+            <w:tcW w:w="963" w:type="dxa"/>
+            <w:tcBorders/>
+          </w:tcPr>
+          <w:p>
+            <w:pPr>
+              <w:pStyle w:val="Normal"/>
+              <w:widowControl/>
+              <w:suppressAutoHyphens w:val="true"/>
               <w:spacing w:lineRule="auto" w:line="240" w:before="0" w:after="0"/>
               <w:jc w:val="end"/>
               <w:rPr>
@@ -7189,13 +7384,14 @@
         <w:trPr/>
         <w:tc>
           <w:tcPr>
-            <w:tcW w:w="1301" w:type="dxa"/>
-            <w:tcBorders/>
-          </w:tcPr>
-          <w:p>
-            <w:pPr>
-              <w:pStyle w:val="Normal"/>
-              <w:widowControl/>
+            <w:tcW w:w="1300" w:type="dxa"/>
+            <w:tcBorders/>
+          </w:tcPr>
+          <w:p>
+            <w:pPr>
+              <w:pStyle w:val="Normal"/>
+              <w:widowControl/>
+              <w:suppressAutoHyphens w:val="true"/>
               <w:spacing w:lineRule="auto" w:line="240" w:before="0" w:after="0"/>
               <w:jc w:val="start"/>
               <w:rPr>
@@ -7218,13 +7414,14 @@
         </w:tc>
         <w:tc>
           <w:tcPr>
-            <w:tcW w:w="962" w:type="dxa"/>
-            <w:tcBorders/>
-          </w:tcPr>
-          <w:p>
-            <w:pPr>
-              <w:pStyle w:val="Normal"/>
-              <w:widowControl/>
+            <w:tcW w:w="963" w:type="dxa"/>
+            <w:tcBorders/>
+          </w:tcPr>
+          <w:p>
+            <w:pPr>
+              <w:pStyle w:val="Normal"/>
+              <w:widowControl/>
+              <w:suppressAutoHyphens w:val="true"/>
               <w:spacing w:lineRule="auto" w:line="240" w:before="0" w:after="0"/>
               <w:jc w:val="end"/>
               <w:rPr>
@@ -7250,13 +7447,14 @@
         <w:trPr/>
         <w:tc>
           <w:tcPr>
-            <w:tcW w:w="1301" w:type="dxa"/>
-            <w:tcBorders/>
-          </w:tcPr>
-          <w:p>
-            <w:pPr>
-              <w:pStyle w:val="Normal"/>
-              <w:widowControl/>
+            <w:tcW w:w="1300" w:type="dxa"/>
+            <w:tcBorders/>
+          </w:tcPr>
+          <w:p>
+            <w:pPr>
+              <w:pStyle w:val="Normal"/>
+              <w:widowControl/>
+              <w:suppressAutoHyphens w:val="true"/>
               <w:spacing w:lineRule="auto" w:line="240" w:before="0" w:after="0"/>
               <w:jc w:val="start"/>
               <w:rPr>
@@ -7279,13 +7477,14 @@
         </w:tc>
         <w:tc>
           <w:tcPr>
-            <w:tcW w:w="962" w:type="dxa"/>
-            <w:tcBorders/>
-          </w:tcPr>
-          <w:p>
-            <w:pPr>
-              <w:pStyle w:val="Normal"/>
-              <w:widowControl/>
+            <w:tcW w:w="963" w:type="dxa"/>
+            <w:tcBorders/>
+          </w:tcPr>
+          <w:p>
+            <w:pPr>
+              <w:pStyle w:val="Normal"/>
+              <w:widowControl/>
+              <w:suppressAutoHyphens w:val="true"/>
               <w:spacing w:lineRule="auto" w:line="240" w:before="0" w:after="0"/>
               <w:jc w:val="end"/>
               <w:rPr>
@@ -7311,13 +7510,14 @@
         <w:trPr/>
         <w:tc>
           <w:tcPr>
-            <w:tcW w:w="1301" w:type="dxa"/>
-            <w:tcBorders/>
-          </w:tcPr>
-          <w:p>
-            <w:pPr>
-              <w:pStyle w:val="Normal"/>
-              <w:widowControl/>
+            <w:tcW w:w="1300" w:type="dxa"/>
+            <w:tcBorders/>
+          </w:tcPr>
+          <w:p>
+            <w:pPr>
+              <w:pStyle w:val="Normal"/>
+              <w:widowControl/>
+              <w:suppressAutoHyphens w:val="true"/>
               <w:spacing w:lineRule="auto" w:line="240" w:before="0" w:after="0"/>
               <w:jc w:val="start"/>
               <w:rPr>
@@ -7340,13 +7540,14 @@
         </w:tc>
         <w:tc>
           <w:tcPr>
-            <w:tcW w:w="962" w:type="dxa"/>
-            <w:tcBorders/>
-          </w:tcPr>
-          <w:p>
-            <w:pPr>
-              <w:pStyle w:val="Normal"/>
-              <w:widowControl/>
+            <w:tcW w:w="963" w:type="dxa"/>
+            <w:tcBorders/>
+          </w:tcPr>
+          <w:p>
+            <w:pPr>
+              <w:pStyle w:val="Normal"/>
+              <w:widowControl/>
+              <w:suppressAutoHyphens w:val="true"/>
               <w:spacing w:lineRule="auto" w:line="240" w:before="0" w:after="0"/>
               <w:jc w:val="end"/>
               <w:rPr>
@@ -7372,13 +7573,14 @@
         <w:trPr/>
         <w:tc>
           <w:tcPr>
-            <w:tcW w:w="1301" w:type="dxa"/>
-            <w:tcBorders/>
-          </w:tcPr>
-          <w:p>
-            <w:pPr>
-              <w:pStyle w:val="Normal"/>
-              <w:widowControl/>
+            <w:tcW w:w="1300" w:type="dxa"/>
+            <w:tcBorders/>
+          </w:tcPr>
+          <w:p>
+            <w:pPr>
+              <w:pStyle w:val="Normal"/>
+              <w:widowControl/>
+              <w:suppressAutoHyphens w:val="true"/>
               <w:spacing w:lineRule="auto" w:line="240" w:before="0" w:after="0"/>
               <w:jc w:val="start"/>
               <w:rPr>
@@ -7401,13 +7603,14 @@
         </w:tc>
         <w:tc>
           <w:tcPr>
-            <w:tcW w:w="962" w:type="dxa"/>
-            <w:tcBorders/>
-          </w:tcPr>
-          <w:p>
-            <w:pPr>
-              <w:pStyle w:val="Normal"/>
-              <w:widowControl/>
+            <w:tcW w:w="963" w:type="dxa"/>
+            <w:tcBorders/>
+          </w:tcPr>
+          <w:p>
+            <w:pPr>
+              <w:pStyle w:val="Normal"/>
+              <w:widowControl/>
+              <w:suppressAutoHyphens w:val="true"/>
               <w:spacing w:lineRule="auto" w:line="240" w:before="0" w:after="0"/>
               <w:jc w:val="end"/>
               <w:rPr>
@@ -7434,13 +7637,14 @@
         <w:trPr/>
         <w:tc>
           <w:tcPr>
-            <w:tcW w:w="1301" w:type="dxa"/>
-            <w:tcBorders/>
-          </w:tcPr>
-          <w:p>
-            <w:pPr>
-              <w:pStyle w:val="Normal"/>
-              <w:widowControl/>
+            <w:tcW w:w="1300" w:type="dxa"/>
+            <w:tcBorders/>
+          </w:tcPr>
+          <w:p>
+            <w:pPr>
+              <w:pStyle w:val="Normal"/>
+              <w:widowControl/>
+              <w:suppressAutoHyphens w:val="true"/>
               <w:spacing w:lineRule="auto" w:line="240" w:before="0" w:after="0"/>
               <w:jc w:val="start"/>
               <w:rPr>
@@ -7463,13 +7667,14 @@
         </w:tc>
         <w:tc>
           <w:tcPr>
-            <w:tcW w:w="962" w:type="dxa"/>
-            <w:tcBorders/>
-          </w:tcPr>
-          <w:p>
-            <w:pPr>
-              <w:pStyle w:val="Normal"/>
-              <w:widowControl/>
+            <w:tcW w:w="963" w:type="dxa"/>
+            <w:tcBorders/>
+          </w:tcPr>
+          <w:p>
+            <w:pPr>
+              <w:pStyle w:val="Normal"/>
+              <w:widowControl/>
+              <w:suppressAutoHyphens w:val="true"/>
               <w:spacing w:lineRule="auto" w:line="240" w:before="0" w:after="0"/>
               <w:jc w:val="end"/>
               <w:rPr>
@@ -7495,13 +7700,14 @@
         <w:trPr/>
         <w:tc>
           <w:tcPr>
-            <w:tcW w:w="1301" w:type="dxa"/>
-            <w:tcBorders/>
-          </w:tcPr>
-          <w:p>
-            <w:pPr>
-              <w:pStyle w:val="Normal"/>
-              <w:widowControl/>
+            <w:tcW w:w="1300" w:type="dxa"/>
+            <w:tcBorders/>
+          </w:tcPr>
+          <w:p>
+            <w:pPr>
+              <w:pStyle w:val="Normal"/>
+              <w:widowControl/>
+              <w:suppressAutoHyphens w:val="true"/>
               <w:spacing w:lineRule="auto" w:line="240" w:before="0" w:after="0"/>
               <w:jc w:val="start"/>
               <w:rPr>
@@ -7524,13 +7730,14 @@
         </w:tc>
         <w:tc>
           <w:tcPr>
-            <w:tcW w:w="962" w:type="dxa"/>
-            <w:tcBorders/>
-          </w:tcPr>
-          <w:p>
-            <w:pPr>
-              <w:pStyle w:val="Normal"/>
-              <w:widowControl/>
+            <w:tcW w:w="963" w:type="dxa"/>
+            <w:tcBorders/>
+          </w:tcPr>
+          <w:p>
+            <w:pPr>
+              <w:pStyle w:val="Normal"/>
+              <w:widowControl/>
+              <w:suppressAutoHyphens w:val="true"/>
               <w:spacing w:lineRule="auto" w:line="240" w:before="0" w:after="0"/>
               <w:jc w:val="end"/>
               <w:rPr>
@@ -7556,13 +7763,14 @@
         <w:trPr/>
         <w:tc>
           <w:tcPr>
-            <w:tcW w:w="1301" w:type="dxa"/>
-            <w:tcBorders/>
-          </w:tcPr>
-          <w:p>
-            <w:pPr>
-              <w:pStyle w:val="Normal"/>
-              <w:widowControl/>
+            <w:tcW w:w="1300" w:type="dxa"/>
+            <w:tcBorders/>
+          </w:tcPr>
+          <w:p>
+            <w:pPr>
+              <w:pStyle w:val="Normal"/>
+              <w:widowControl/>
+              <w:suppressAutoHyphens w:val="true"/>
               <w:spacing w:lineRule="auto" w:line="240" w:before="0" w:after="0"/>
               <w:jc w:val="start"/>
               <w:rPr>
@@ -7585,13 +7793,14 @@
         </w:tc>
         <w:tc>
           <w:tcPr>
-            <w:tcW w:w="962" w:type="dxa"/>
-            <w:tcBorders/>
-          </w:tcPr>
-          <w:p>
-            <w:pPr>
-              <w:pStyle w:val="Normal"/>
-              <w:widowControl/>
+            <w:tcW w:w="963" w:type="dxa"/>
+            <w:tcBorders/>
+          </w:tcPr>
+          <w:p>
+            <w:pPr>
+              <w:pStyle w:val="Normal"/>
+              <w:widowControl/>
+              <w:suppressAutoHyphens w:val="true"/>
               <w:spacing w:lineRule="auto" w:line="240" w:before="0" w:after="0"/>
               <w:jc w:val="end"/>
               <w:rPr>
@@ -7665,6 +7874,7 @@
             <w:pPr>
               <w:pStyle w:val="Normal"/>
               <w:widowControl/>
+              <w:suppressAutoHyphens w:val="true"/>
               <w:spacing w:lineRule="auto" w:line="240" w:before="0" w:after="0"/>
               <w:jc w:val="start"/>
               <w:rPr>
@@ -7694,6 +7904,7 @@
             <w:pPr>
               <w:pStyle w:val="Normal"/>
               <w:widowControl/>
+              <w:suppressAutoHyphens w:val="true"/>
               <w:spacing w:lineRule="auto" w:line="240" w:before="0" w:after="0"/>
               <w:jc w:val="end"/>
               <w:rPr>
@@ -7726,6 +7937,7 @@
             <w:pPr>
               <w:pStyle w:val="Normal"/>
               <w:widowControl/>
+              <w:suppressAutoHyphens w:val="true"/>
               <w:spacing w:lineRule="auto" w:line="240" w:before="0" w:after="0"/>
               <w:jc w:val="start"/>
               <w:rPr>
@@ -7755,6 +7967,7 @@
             <w:pPr>
               <w:pStyle w:val="Normal"/>
               <w:widowControl/>
+              <w:suppressAutoHyphens w:val="true"/>
               <w:spacing w:lineRule="auto" w:line="240" w:before="0" w:after="0"/>
               <w:jc w:val="end"/>
               <w:rPr>
@@ -7874,20 +8087,21 @@
         <w:tblLook w:val="04a0" w:firstRow="1" w:noVBand="1" w:lastRow="0" w:firstColumn="1" w:lastColumn="0" w:noHBand="0"/>
       </w:tblPr>
       <w:tblGrid>
-        <w:gridCol w:w="1667"/>
-        <w:gridCol w:w="851"/>
+        <w:gridCol w:w="1666"/>
+        <w:gridCol w:w="852"/>
       </w:tblGrid>
       <w:tr>
         <w:trPr/>
         <w:tc>
           <w:tcPr>
-            <w:tcW w:w="1667" w:type="dxa"/>
-            <w:tcBorders/>
-          </w:tcPr>
-          <w:p>
-            <w:pPr>
-              <w:pStyle w:val="Normal"/>
-              <w:widowControl/>
+            <w:tcW w:w="1666" w:type="dxa"/>
+            <w:tcBorders/>
+          </w:tcPr>
+          <w:p>
+            <w:pPr>
+              <w:pStyle w:val="Normal"/>
+              <w:widowControl/>
+              <w:suppressAutoHyphens w:val="true"/>
               <w:spacing w:lineRule="auto" w:line="240" w:before="0" w:after="0"/>
               <w:jc w:val="start"/>
               <w:rPr>
@@ -7910,13 +8124,14 @@
         </w:tc>
         <w:tc>
           <w:tcPr>
-            <w:tcW w:w="851" w:type="dxa"/>
-            <w:tcBorders/>
-          </w:tcPr>
-          <w:p>
-            <w:pPr>
-              <w:pStyle w:val="Normal"/>
-              <w:widowControl/>
+            <w:tcW w:w="852" w:type="dxa"/>
+            <w:tcBorders/>
+          </w:tcPr>
+          <w:p>
+            <w:pPr>
+              <w:pStyle w:val="Normal"/>
+              <w:widowControl/>
+              <w:suppressAutoHyphens w:val="true"/>
               <w:spacing w:lineRule="auto" w:line="240" w:before="0" w:after="0"/>
               <w:jc w:val="end"/>
               <w:rPr>
@@ -7952,13 +8167,14 @@
         <w:trPr/>
         <w:tc>
           <w:tcPr>
-            <w:tcW w:w="1667" w:type="dxa"/>
-            <w:tcBorders/>
-          </w:tcPr>
-          <w:p>
-            <w:pPr>
-              <w:pStyle w:val="Normal"/>
-              <w:widowControl/>
+            <w:tcW w:w="1666" w:type="dxa"/>
+            <w:tcBorders/>
+          </w:tcPr>
+          <w:p>
+            <w:pPr>
+              <w:pStyle w:val="Normal"/>
+              <w:widowControl/>
+              <w:suppressAutoHyphens w:val="true"/>
               <w:spacing w:lineRule="auto" w:line="240" w:before="0" w:after="0"/>
               <w:jc w:val="start"/>
               <w:rPr>
@@ -7981,13 +8197,14 @@
         </w:tc>
         <w:tc>
           <w:tcPr>
-            <w:tcW w:w="851" w:type="dxa"/>
-            <w:tcBorders/>
-          </w:tcPr>
-          <w:p>
-            <w:pPr>
-              <w:pStyle w:val="Normal"/>
-              <w:widowControl/>
+            <w:tcW w:w="852" w:type="dxa"/>
+            <w:tcBorders/>
+          </w:tcPr>
+          <w:p>
+            <w:pPr>
+              <w:pStyle w:val="Normal"/>
+              <w:widowControl/>
+              <w:suppressAutoHyphens w:val="true"/>
               <w:spacing w:lineRule="auto" w:line="240" w:before="0" w:after="0"/>
               <w:jc w:val="end"/>
               <w:rPr>
@@ -8013,13 +8230,14 @@
         <w:trPr/>
         <w:tc>
           <w:tcPr>
-            <w:tcW w:w="1667" w:type="dxa"/>
-            <w:tcBorders/>
-          </w:tcPr>
-          <w:p>
-            <w:pPr>
-              <w:pStyle w:val="Normal"/>
-              <w:widowControl/>
+            <w:tcW w:w="1666" w:type="dxa"/>
+            <w:tcBorders/>
+          </w:tcPr>
+          <w:p>
+            <w:pPr>
+              <w:pStyle w:val="Normal"/>
+              <w:widowControl/>
+              <w:suppressAutoHyphens w:val="true"/>
               <w:spacing w:lineRule="auto" w:line="240" w:before="0" w:after="0"/>
               <w:jc w:val="start"/>
               <w:rPr>
@@ -8042,13 +8260,14 @@
         </w:tc>
         <w:tc>
           <w:tcPr>
-            <w:tcW w:w="851" w:type="dxa"/>
-            <w:tcBorders/>
-          </w:tcPr>
-          <w:p>
-            <w:pPr>
-              <w:pStyle w:val="Normal"/>
-              <w:widowControl/>
+            <w:tcW w:w="852" w:type="dxa"/>
+            <w:tcBorders/>
+          </w:tcPr>
+          <w:p>
+            <w:pPr>
+              <w:pStyle w:val="Normal"/>
+              <w:widowControl/>
+              <w:suppressAutoHyphens w:val="true"/>
               <w:spacing w:lineRule="auto" w:line="240" w:before="0" w:after="0"/>
               <w:jc w:val="end"/>
               <w:rPr>
@@ -8074,13 +8293,14 @@
         <w:trPr/>
         <w:tc>
           <w:tcPr>
-            <w:tcW w:w="1667" w:type="dxa"/>
-            <w:tcBorders/>
-          </w:tcPr>
-          <w:p>
-            <w:pPr>
-              <w:pStyle w:val="Normal"/>
-              <w:widowControl/>
+            <w:tcW w:w="1666" w:type="dxa"/>
+            <w:tcBorders/>
+          </w:tcPr>
+          <w:p>
+            <w:pPr>
+              <w:pStyle w:val="Normal"/>
+              <w:widowControl/>
+              <w:suppressAutoHyphens w:val="true"/>
               <w:spacing w:lineRule="auto" w:line="240" w:before="0" w:after="0"/>
               <w:jc w:val="start"/>
               <w:rPr>
@@ -8103,13 +8323,14 @@
         </w:tc>
         <w:tc>
           <w:tcPr>
-            <w:tcW w:w="851" w:type="dxa"/>
-            <w:tcBorders/>
-          </w:tcPr>
-          <w:p>
-            <w:pPr>
-              <w:pStyle w:val="Normal"/>
-              <w:widowControl/>
+            <w:tcW w:w="852" w:type="dxa"/>
+            <w:tcBorders/>
+          </w:tcPr>
+          <w:p>
+            <w:pPr>
+              <w:pStyle w:val="Normal"/>
+              <w:widowControl/>
+              <w:suppressAutoHyphens w:val="true"/>
               <w:spacing w:lineRule="auto" w:line="240" w:before="0" w:after="0"/>
               <w:jc w:val="end"/>
               <w:rPr>
@@ -8135,13 +8356,14 @@
         <w:trPr/>
         <w:tc>
           <w:tcPr>
-            <w:tcW w:w="1667" w:type="dxa"/>
-            <w:tcBorders/>
-          </w:tcPr>
-          <w:p>
-            <w:pPr>
-              <w:pStyle w:val="Normal"/>
-              <w:widowControl/>
+            <w:tcW w:w="1666" w:type="dxa"/>
+            <w:tcBorders/>
+          </w:tcPr>
+          <w:p>
+            <w:pPr>
+              <w:pStyle w:val="Normal"/>
+              <w:widowControl/>
+              <w:suppressAutoHyphens w:val="true"/>
               <w:spacing w:lineRule="auto" w:line="240" w:before="0" w:after="0"/>
               <w:jc w:val="start"/>
               <w:rPr>
@@ -8164,13 +8386,14 @@
         </w:tc>
         <w:tc>
           <w:tcPr>
-            <w:tcW w:w="851" w:type="dxa"/>
-            <w:tcBorders/>
-          </w:tcPr>
-          <w:p>
-            <w:pPr>
-              <w:pStyle w:val="Normal"/>
-              <w:widowControl/>
+            <w:tcW w:w="852" w:type="dxa"/>
+            <w:tcBorders/>
+          </w:tcPr>
+          <w:p>
+            <w:pPr>
+              <w:pStyle w:val="Normal"/>
+              <w:widowControl/>
+              <w:suppressAutoHyphens w:val="true"/>
               <w:spacing w:lineRule="auto" w:line="240" w:before="0" w:after="0"/>
               <w:jc w:val="end"/>
               <w:rPr>
@@ -8196,13 +8419,14 @@
         <w:trPr/>
         <w:tc>
           <w:tcPr>
-            <w:tcW w:w="1667" w:type="dxa"/>
-            <w:tcBorders/>
-          </w:tcPr>
-          <w:p>
-            <w:pPr>
-              <w:pStyle w:val="Normal"/>
-              <w:widowControl/>
+            <w:tcW w:w="1666" w:type="dxa"/>
+            <w:tcBorders/>
+          </w:tcPr>
+          <w:p>
+            <w:pPr>
+              <w:pStyle w:val="Normal"/>
+              <w:widowControl/>
+              <w:suppressAutoHyphens w:val="true"/>
               <w:spacing w:lineRule="auto" w:line="240" w:before="0" w:after="0"/>
               <w:jc w:val="start"/>
               <w:rPr>
@@ -8225,13 +8449,14 @@
         </w:tc>
         <w:tc>
           <w:tcPr>
-            <w:tcW w:w="851" w:type="dxa"/>
-            <w:tcBorders/>
-          </w:tcPr>
-          <w:p>
-            <w:pPr>
-              <w:pStyle w:val="Normal"/>
-              <w:widowControl/>
+            <w:tcW w:w="852" w:type="dxa"/>
+            <w:tcBorders/>
+          </w:tcPr>
+          <w:p>
+            <w:pPr>
+              <w:pStyle w:val="Normal"/>
+              <w:widowControl/>
+              <w:suppressAutoHyphens w:val="true"/>
               <w:spacing w:lineRule="auto" w:line="240" w:before="0" w:after="0"/>
               <w:jc w:val="end"/>
               <w:rPr>
@@ -8257,13 +8482,14 @@
         <w:trPr/>
         <w:tc>
           <w:tcPr>
-            <w:tcW w:w="1667" w:type="dxa"/>
-            <w:tcBorders/>
-          </w:tcPr>
-          <w:p>
-            <w:pPr>
-              <w:pStyle w:val="Normal"/>
-              <w:widowControl/>
+            <w:tcW w:w="1666" w:type="dxa"/>
+            <w:tcBorders/>
+          </w:tcPr>
+          <w:p>
+            <w:pPr>
+              <w:pStyle w:val="Normal"/>
+              <w:widowControl/>
+              <w:suppressAutoHyphens w:val="true"/>
               <w:spacing w:lineRule="auto" w:line="240" w:before="0" w:after="0"/>
               <w:jc w:val="start"/>
               <w:rPr>
@@ -8286,13 +8512,14 @@
         </w:tc>
         <w:tc>
           <w:tcPr>
-            <w:tcW w:w="851" w:type="dxa"/>
-            <w:tcBorders/>
-          </w:tcPr>
-          <w:p>
-            <w:pPr>
-              <w:pStyle w:val="Normal"/>
-              <w:widowControl/>
+            <w:tcW w:w="852" w:type="dxa"/>
+            <w:tcBorders/>
+          </w:tcPr>
+          <w:p>
+            <w:pPr>
+              <w:pStyle w:val="Normal"/>
+              <w:widowControl/>
+              <w:suppressAutoHyphens w:val="true"/>
               <w:spacing w:lineRule="auto" w:line="240" w:before="0" w:after="0"/>
               <w:jc w:val="end"/>
               <w:rPr>
@@ -8318,13 +8545,14 @@
         <w:trPr/>
         <w:tc>
           <w:tcPr>
-            <w:tcW w:w="1667" w:type="dxa"/>
-            <w:tcBorders/>
-          </w:tcPr>
-          <w:p>
-            <w:pPr>
-              <w:pStyle w:val="Normal"/>
-              <w:widowControl/>
+            <w:tcW w:w="1666" w:type="dxa"/>
+            <w:tcBorders/>
+          </w:tcPr>
+          <w:p>
+            <w:pPr>
+              <w:pStyle w:val="Normal"/>
+              <w:widowControl/>
+              <w:suppressAutoHyphens w:val="true"/>
               <w:spacing w:lineRule="auto" w:line="240" w:before="0" w:after="0"/>
               <w:jc w:val="start"/>
               <w:rPr>
@@ -8347,13 +8575,14 @@
         </w:tc>
         <w:tc>
           <w:tcPr>
-            <w:tcW w:w="851" w:type="dxa"/>
-            <w:tcBorders/>
-          </w:tcPr>
-          <w:p>
-            <w:pPr>
-              <w:pStyle w:val="Normal"/>
-              <w:widowControl/>
+            <w:tcW w:w="852" w:type="dxa"/>
+            <w:tcBorders/>
+          </w:tcPr>
+          <w:p>
+            <w:pPr>
+              <w:pStyle w:val="Normal"/>
+              <w:widowControl/>
+              <w:suppressAutoHyphens w:val="true"/>
               <w:spacing w:lineRule="auto" w:line="240" w:before="0" w:after="0"/>
               <w:jc w:val="end"/>
               <w:rPr>
@@ -8379,13 +8608,14 @@
         <w:trPr/>
         <w:tc>
           <w:tcPr>
-            <w:tcW w:w="1667" w:type="dxa"/>
-            <w:tcBorders/>
-          </w:tcPr>
-          <w:p>
-            <w:pPr>
-              <w:pStyle w:val="Normal"/>
-              <w:widowControl/>
+            <w:tcW w:w="1666" w:type="dxa"/>
+            <w:tcBorders/>
+          </w:tcPr>
+          <w:p>
+            <w:pPr>
+              <w:pStyle w:val="Normal"/>
+              <w:widowControl/>
+              <w:suppressAutoHyphens w:val="true"/>
               <w:spacing w:lineRule="auto" w:line="240" w:before="0" w:after="0"/>
               <w:jc w:val="start"/>
               <w:rPr>
@@ -8408,13 +8638,14 @@
         </w:tc>
         <w:tc>
           <w:tcPr>
-            <w:tcW w:w="851" w:type="dxa"/>
-            <w:tcBorders/>
-          </w:tcPr>
-          <w:p>
-            <w:pPr>
-              <w:pStyle w:val="Normal"/>
-              <w:widowControl/>
+            <w:tcW w:w="852" w:type="dxa"/>
+            <w:tcBorders/>
+          </w:tcPr>
+          <w:p>
+            <w:pPr>
+              <w:pStyle w:val="Normal"/>
+              <w:widowControl/>
+              <w:suppressAutoHyphens w:val="true"/>
               <w:spacing w:lineRule="auto" w:line="240" w:before="0" w:after="0"/>
               <w:jc w:val="end"/>
               <w:rPr>
@@ -8440,13 +8671,14 @@
         <w:trPr/>
         <w:tc>
           <w:tcPr>
-            <w:tcW w:w="1667" w:type="dxa"/>
-            <w:tcBorders/>
-          </w:tcPr>
-          <w:p>
-            <w:pPr>
-              <w:pStyle w:val="Normal"/>
-              <w:widowControl/>
+            <w:tcW w:w="1666" w:type="dxa"/>
+            <w:tcBorders/>
+          </w:tcPr>
+          <w:p>
+            <w:pPr>
+              <w:pStyle w:val="Normal"/>
+              <w:widowControl/>
+              <w:suppressAutoHyphens w:val="true"/>
               <w:spacing w:lineRule="auto" w:line="240" w:before="0" w:after="0"/>
               <w:jc w:val="start"/>
               <w:rPr>
@@ -8469,13 +8701,14 @@
         </w:tc>
         <w:tc>
           <w:tcPr>
-            <w:tcW w:w="851" w:type="dxa"/>
-            <w:tcBorders/>
-          </w:tcPr>
-          <w:p>
-            <w:pPr>
-              <w:pStyle w:val="Normal"/>
-              <w:widowControl/>
+            <w:tcW w:w="852" w:type="dxa"/>
+            <w:tcBorders/>
+          </w:tcPr>
+          <w:p>
+            <w:pPr>
+              <w:pStyle w:val="Normal"/>
+              <w:widowControl/>
+              <w:suppressAutoHyphens w:val="true"/>
               <w:spacing w:lineRule="auto" w:line="240" w:before="0" w:after="0"/>
               <w:jc w:val="end"/>
               <w:rPr>
@@ -8501,13 +8734,14 @@
         <w:trPr/>
         <w:tc>
           <w:tcPr>
-            <w:tcW w:w="1667" w:type="dxa"/>
-            <w:tcBorders/>
-          </w:tcPr>
-          <w:p>
-            <w:pPr>
-              <w:pStyle w:val="Normal"/>
-              <w:widowControl/>
+            <w:tcW w:w="1666" w:type="dxa"/>
+            <w:tcBorders/>
+          </w:tcPr>
+          <w:p>
+            <w:pPr>
+              <w:pStyle w:val="Normal"/>
+              <w:widowControl/>
+              <w:suppressAutoHyphens w:val="true"/>
               <w:spacing w:lineRule="auto" w:line="240" w:before="0" w:after="0"/>
               <w:jc w:val="start"/>
               <w:rPr>
@@ -8530,13 +8764,14 @@
         </w:tc>
         <w:tc>
           <w:tcPr>
-            <w:tcW w:w="851" w:type="dxa"/>
-            <w:tcBorders/>
-          </w:tcPr>
-          <w:p>
-            <w:pPr>
-              <w:pStyle w:val="Normal"/>
-              <w:widowControl/>
+            <w:tcW w:w="852" w:type="dxa"/>
+            <w:tcBorders/>
+          </w:tcPr>
+          <w:p>
+            <w:pPr>
+              <w:pStyle w:val="Normal"/>
+              <w:widowControl/>
+              <w:suppressAutoHyphens w:val="true"/>
               <w:spacing w:lineRule="auto" w:line="240" w:before="0" w:after="0"/>
               <w:jc w:val="end"/>
               <w:rPr>
@@ -8562,13 +8797,14 @@
         <w:trPr/>
         <w:tc>
           <w:tcPr>
-            <w:tcW w:w="1667" w:type="dxa"/>
-            <w:tcBorders/>
-          </w:tcPr>
-          <w:p>
-            <w:pPr>
-              <w:pStyle w:val="Normal"/>
-              <w:widowControl/>
+            <w:tcW w:w="1666" w:type="dxa"/>
+            <w:tcBorders/>
+          </w:tcPr>
+          <w:p>
+            <w:pPr>
+              <w:pStyle w:val="Normal"/>
+              <w:widowControl/>
+              <w:suppressAutoHyphens w:val="true"/>
               <w:spacing w:lineRule="auto" w:line="240" w:before="0" w:after="0"/>
               <w:jc w:val="start"/>
               <w:rPr>
@@ -8591,13 +8827,14 @@
         </w:tc>
         <w:tc>
           <w:tcPr>
-            <w:tcW w:w="851" w:type="dxa"/>
-            <w:tcBorders/>
-          </w:tcPr>
-          <w:p>
-            <w:pPr>
-              <w:pStyle w:val="Normal"/>
-              <w:widowControl/>
+            <w:tcW w:w="852" w:type="dxa"/>
+            <w:tcBorders/>
+          </w:tcPr>
+          <w:p>
+            <w:pPr>
+              <w:pStyle w:val="Normal"/>
+              <w:widowControl/>
+              <w:suppressAutoHyphens w:val="true"/>
               <w:spacing w:lineRule="auto" w:line="240" w:before="0" w:after="0"/>
               <w:jc w:val="end"/>
               <w:rPr>
@@ -8623,13 +8860,14 @@
         <w:trPr/>
         <w:tc>
           <w:tcPr>
-            <w:tcW w:w="1667" w:type="dxa"/>
-            <w:tcBorders/>
-          </w:tcPr>
-          <w:p>
-            <w:pPr>
-              <w:pStyle w:val="Normal"/>
-              <w:widowControl/>
+            <w:tcW w:w="1666" w:type="dxa"/>
+            <w:tcBorders/>
+          </w:tcPr>
+          <w:p>
+            <w:pPr>
+              <w:pStyle w:val="Normal"/>
+              <w:widowControl/>
+              <w:suppressAutoHyphens w:val="true"/>
               <w:spacing w:lineRule="auto" w:line="240" w:before="0" w:after="0"/>
               <w:jc w:val="start"/>
               <w:rPr>
@@ -8652,13 +8890,14 @@
         </w:tc>
         <w:tc>
           <w:tcPr>
-            <w:tcW w:w="851" w:type="dxa"/>
-            <w:tcBorders/>
-          </w:tcPr>
-          <w:p>
-            <w:pPr>
-              <w:pStyle w:val="Normal"/>
-              <w:widowControl/>
+            <w:tcW w:w="852" w:type="dxa"/>
+            <w:tcBorders/>
+          </w:tcPr>
+          <w:p>
+            <w:pPr>
+              <w:pStyle w:val="Normal"/>
+              <w:widowControl/>
+              <w:suppressAutoHyphens w:val="true"/>
               <w:spacing w:lineRule="auto" w:line="240" w:before="0" w:after="0"/>
               <w:jc w:val="end"/>
               <w:rPr>
@@ -8684,13 +8923,14 @@
         <w:trPr/>
         <w:tc>
           <w:tcPr>
-            <w:tcW w:w="1667" w:type="dxa"/>
-            <w:tcBorders/>
-          </w:tcPr>
-          <w:p>
-            <w:pPr>
-              <w:pStyle w:val="Normal"/>
-              <w:widowControl/>
+            <w:tcW w:w="1666" w:type="dxa"/>
+            <w:tcBorders/>
+          </w:tcPr>
+          <w:p>
+            <w:pPr>
+              <w:pStyle w:val="Normal"/>
+              <w:widowControl/>
+              <w:suppressAutoHyphens w:val="true"/>
               <w:spacing w:lineRule="auto" w:line="240" w:before="0" w:after="0"/>
               <w:jc w:val="start"/>
               <w:rPr>
@@ -8713,13 +8953,14 @@
         </w:tc>
         <w:tc>
           <w:tcPr>
-            <w:tcW w:w="851" w:type="dxa"/>
-            <w:tcBorders/>
-          </w:tcPr>
-          <w:p>
-            <w:pPr>
-              <w:pStyle w:val="Normal"/>
-              <w:widowControl/>
+            <w:tcW w:w="852" w:type="dxa"/>
+            <w:tcBorders/>
+          </w:tcPr>
+          <w:p>
+            <w:pPr>
+              <w:pStyle w:val="Normal"/>
+              <w:widowControl/>
+              <w:suppressAutoHyphens w:val="true"/>
               <w:spacing w:lineRule="auto" w:line="240" w:before="0" w:after="0"/>
               <w:jc w:val="end"/>
               <w:rPr>
@@ -8745,13 +8986,14 @@
         <w:trPr/>
         <w:tc>
           <w:tcPr>
-            <w:tcW w:w="1667" w:type="dxa"/>
-            <w:tcBorders/>
-          </w:tcPr>
-          <w:p>
-            <w:pPr>
-              <w:pStyle w:val="Normal"/>
-              <w:widowControl/>
+            <w:tcW w:w="1666" w:type="dxa"/>
+            <w:tcBorders/>
+          </w:tcPr>
+          <w:p>
+            <w:pPr>
+              <w:pStyle w:val="Normal"/>
+              <w:widowControl/>
+              <w:suppressAutoHyphens w:val="true"/>
               <w:spacing w:lineRule="auto" w:line="240" w:before="0" w:after="0"/>
               <w:jc w:val="start"/>
               <w:rPr>
@@ -8774,13 +9016,14 @@
         </w:tc>
         <w:tc>
           <w:tcPr>
-            <w:tcW w:w="851" w:type="dxa"/>
-            <w:tcBorders/>
-          </w:tcPr>
-          <w:p>
-            <w:pPr>
-              <w:pStyle w:val="Normal"/>
-              <w:widowControl/>
+            <w:tcW w:w="852" w:type="dxa"/>
+            <w:tcBorders/>
+          </w:tcPr>
+          <w:p>
+            <w:pPr>
+              <w:pStyle w:val="Normal"/>
+              <w:widowControl/>
+              <w:suppressAutoHyphens w:val="true"/>
               <w:spacing w:lineRule="auto" w:line="240" w:before="0" w:after="0"/>
               <w:jc w:val="end"/>
               <w:rPr>
@@ -8806,13 +9049,14 @@
         <w:trPr/>
         <w:tc>
           <w:tcPr>
-            <w:tcW w:w="1667" w:type="dxa"/>
-            <w:tcBorders/>
-          </w:tcPr>
-          <w:p>
-            <w:pPr>
-              <w:pStyle w:val="Normal"/>
-              <w:widowControl/>
+            <w:tcW w:w="1666" w:type="dxa"/>
+            <w:tcBorders/>
+          </w:tcPr>
+          <w:p>
+            <w:pPr>
+              <w:pStyle w:val="Normal"/>
+              <w:widowControl/>
+              <w:suppressAutoHyphens w:val="true"/>
               <w:spacing w:lineRule="auto" w:line="240" w:before="0" w:after="0"/>
               <w:jc w:val="start"/>
               <w:rPr>
@@ -8835,13 +9079,14 @@
         </w:tc>
         <w:tc>
           <w:tcPr>
-            <w:tcW w:w="851" w:type="dxa"/>
-            <w:tcBorders/>
-          </w:tcPr>
-          <w:p>
-            <w:pPr>
-              <w:pStyle w:val="Normal"/>
-              <w:widowControl/>
+            <w:tcW w:w="852" w:type="dxa"/>
+            <w:tcBorders/>
+          </w:tcPr>
+          <w:p>
+            <w:pPr>
+              <w:pStyle w:val="Normal"/>
+              <w:widowControl/>
+              <w:suppressAutoHyphens w:val="true"/>
               <w:spacing w:lineRule="auto" w:line="240" w:before="0" w:after="0"/>
               <w:jc w:val="end"/>
               <w:rPr>
@@ -8867,13 +9112,14 @@
         <w:trPr/>
         <w:tc>
           <w:tcPr>
-            <w:tcW w:w="1667" w:type="dxa"/>
-            <w:tcBorders/>
-          </w:tcPr>
-          <w:p>
-            <w:pPr>
-              <w:pStyle w:val="Normal"/>
-              <w:widowControl/>
+            <w:tcW w:w="1666" w:type="dxa"/>
+            <w:tcBorders/>
+          </w:tcPr>
+          <w:p>
+            <w:pPr>
+              <w:pStyle w:val="Normal"/>
+              <w:widowControl/>
+              <w:suppressAutoHyphens w:val="true"/>
               <w:spacing w:lineRule="auto" w:line="240" w:before="0" w:after="0"/>
               <w:jc w:val="start"/>
               <w:rPr>
@@ -8890,19 +9136,40 @@
                 <w:szCs w:val="20"/>
                 <w:lang w:val="pt-BR" w:eastAsia="en-US" w:bidi="ar-SA"/>
               </w:rPr>
-              <w:t>Arco Comosto</w:t>
-            </w:r>
-          </w:p>
-        </w:tc>
-        <w:tc>
-          <w:tcPr>
-            <w:tcW w:w="851" w:type="dxa"/>
-            <w:tcBorders/>
-          </w:tcPr>
-          <w:p>
-            <w:pPr>
-              <w:pStyle w:val="Normal"/>
-              <w:widowControl/>
+              <w:t>Arco Com</w:t>
+            </w:r>
+            <w:r>
+              <w:rPr>
+                <w:rFonts w:eastAsia="Calibri" w:cs="Arial" w:ascii="Arial" w:hAnsi="Arial"/>
+                <w:kern w:val="0"/>
+                <w:sz w:val="20"/>
+                <w:szCs w:val="20"/>
+                <w:lang w:val="pt-BR" w:eastAsia="en-US" w:bidi="ar-SA"/>
+              </w:rPr>
+              <w:t>p</w:t>
+            </w:r>
+            <w:r>
+              <w:rPr>
+                <w:rFonts w:eastAsia="Calibri" w:cs="Arial" w:ascii="Arial" w:hAnsi="Arial"/>
+                <w:kern w:val="0"/>
+                <w:sz w:val="20"/>
+                <w:szCs w:val="20"/>
+                <w:lang w:val="pt-BR" w:eastAsia="en-US" w:bidi="ar-SA"/>
+              </w:rPr>
+              <w:t>osto</w:t>
+            </w:r>
+          </w:p>
+        </w:tc>
+        <w:tc>
+          <w:tcPr>
+            <w:tcW w:w="852" w:type="dxa"/>
+            <w:tcBorders/>
+          </w:tcPr>
+          <w:p>
+            <w:pPr>
+              <w:pStyle w:val="Normal"/>
+              <w:widowControl/>
+              <w:suppressAutoHyphens w:val="true"/>
               <w:spacing w:lineRule="auto" w:line="240" w:before="0" w:after="0"/>
               <w:jc w:val="end"/>
               <w:rPr>
@@ -8928,13 +9195,14 @@
         <w:trPr/>
         <w:tc>
           <w:tcPr>
-            <w:tcW w:w="1667" w:type="dxa"/>
-            <w:tcBorders/>
-          </w:tcPr>
-          <w:p>
-            <w:pPr>
-              <w:pStyle w:val="Normal"/>
-              <w:widowControl/>
+            <w:tcW w:w="1666" w:type="dxa"/>
+            <w:tcBorders/>
+          </w:tcPr>
+          <w:p>
+            <w:pPr>
+              <w:pStyle w:val="Normal"/>
+              <w:widowControl/>
+              <w:suppressAutoHyphens w:val="true"/>
               <w:spacing w:lineRule="auto" w:line="240" w:before="0" w:after="0"/>
               <w:jc w:val="start"/>
               <w:rPr>
@@ -8967,13 +9235,14 @@
         </w:tc>
         <w:tc>
           <w:tcPr>
-            <w:tcW w:w="851" w:type="dxa"/>
-            <w:tcBorders/>
-          </w:tcPr>
-          <w:p>
-            <w:pPr>
-              <w:pStyle w:val="Normal"/>
-              <w:widowControl/>
+            <w:tcW w:w="852" w:type="dxa"/>
+            <w:tcBorders/>
+          </w:tcPr>
+          <w:p>
+            <w:pPr>
+              <w:pStyle w:val="Normal"/>
+              <w:widowControl/>
+              <w:suppressAutoHyphens w:val="true"/>
               <w:spacing w:lineRule="auto" w:line="240" w:before="0" w:after="0"/>
               <w:jc w:val="end"/>
               <w:rPr>
@@ -8999,13 +9268,14 @@
         <w:trPr/>
         <w:tc>
           <w:tcPr>
-            <w:tcW w:w="1667" w:type="dxa"/>
-            <w:tcBorders/>
-          </w:tcPr>
-          <w:p>
-            <w:pPr>
-              <w:pStyle w:val="Normal"/>
-              <w:widowControl/>
+            <w:tcW w:w="1666" w:type="dxa"/>
+            <w:tcBorders/>
+          </w:tcPr>
+          <w:p>
+            <w:pPr>
+              <w:pStyle w:val="Normal"/>
+              <w:widowControl/>
+              <w:suppressAutoHyphens w:val="true"/>
               <w:spacing w:lineRule="auto" w:line="240" w:before="0" w:after="0"/>
               <w:jc w:val="start"/>
               <w:rPr>
@@ -9028,13 +9298,14 @@
         </w:tc>
         <w:tc>
           <w:tcPr>
-            <w:tcW w:w="851" w:type="dxa"/>
-            <w:tcBorders/>
-          </w:tcPr>
-          <w:p>
-            <w:pPr>
-              <w:pStyle w:val="Normal"/>
-              <w:widowControl/>
+            <w:tcW w:w="852" w:type="dxa"/>
+            <w:tcBorders/>
+          </w:tcPr>
+          <w:p>
+            <w:pPr>
+              <w:pStyle w:val="Normal"/>
+              <w:widowControl/>
+              <w:suppressAutoHyphens w:val="true"/>
               <w:spacing w:lineRule="auto" w:line="240" w:before="0" w:after="0"/>
               <w:jc w:val="end"/>
               <w:rPr>
@@ -9060,13 +9331,14 @@
         <w:trPr/>
         <w:tc>
           <w:tcPr>
-            <w:tcW w:w="1667" w:type="dxa"/>
-            <w:tcBorders/>
-          </w:tcPr>
-          <w:p>
-            <w:pPr>
-              <w:pStyle w:val="Normal"/>
-              <w:widowControl/>
+            <w:tcW w:w="1666" w:type="dxa"/>
+            <w:tcBorders/>
+          </w:tcPr>
+          <w:p>
+            <w:pPr>
+              <w:pStyle w:val="Normal"/>
+              <w:widowControl/>
+              <w:suppressAutoHyphens w:val="true"/>
               <w:spacing w:lineRule="auto" w:line="240" w:before="0" w:after="0"/>
               <w:jc w:val="start"/>
               <w:rPr>
@@ -9099,13 +9371,14 @@
         </w:tc>
         <w:tc>
           <w:tcPr>
-            <w:tcW w:w="851" w:type="dxa"/>
-            <w:tcBorders/>
-          </w:tcPr>
-          <w:p>
-            <w:pPr>
-              <w:pStyle w:val="Normal"/>
-              <w:widowControl/>
+            <w:tcW w:w="852" w:type="dxa"/>
+            <w:tcBorders/>
+          </w:tcPr>
+          <w:p>
+            <w:pPr>
+              <w:pStyle w:val="Normal"/>
+              <w:widowControl/>
+              <w:suppressAutoHyphens w:val="true"/>
               <w:spacing w:lineRule="auto" w:line="240" w:before="0" w:after="0"/>
               <w:jc w:val="end"/>
               <w:rPr>
@@ -9164,20 +9437,21 @@
         <w:tblLook w:val="04a0" w:firstRow="1" w:noVBand="1" w:lastRow="0" w:firstColumn="1" w:lastColumn="0" w:noHBand="0"/>
       </w:tblPr>
       <w:tblGrid>
-        <w:gridCol w:w="1667"/>
-        <w:gridCol w:w="851"/>
+        <w:gridCol w:w="1666"/>
+        <w:gridCol w:w="852"/>
       </w:tblGrid>
       <w:tr>
         <w:trPr/>
         <w:tc>
           <w:tcPr>
-            <w:tcW w:w="1667" w:type="dxa"/>
-            <w:tcBorders/>
-          </w:tcPr>
-          <w:p>
-            <w:pPr>
-              <w:pStyle w:val="Normal"/>
-              <w:widowControl/>
+            <w:tcW w:w="1666" w:type="dxa"/>
+            <w:tcBorders/>
+          </w:tcPr>
+          <w:p>
+            <w:pPr>
+              <w:pStyle w:val="Normal"/>
+              <w:widowControl/>
+              <w:suppressAutoHyphens w:val="true"/>
               <w:spacing w:lineRule="auto" w:line="240" w:before="0" w:after="0"/>
               <w:jc w:val="start"/>
               <w:rPr>
@@ -9202,13 +9476,14 @@
         </w:tc>
         <w:tc>
           <w:tcPr>
-            <w:tcW w:w="851" w:type="dxa"/>
-            <w:tcBorders/>
-          </w:tcPr>
-          <w:p>
-            <w:pPr>
-              <w:pStyle w:val="Normal"/>
-              <w:widowControl/>
+            <w:tcW w:w="852" w:type="dxa"/>
+            <w:tcBorders/>
+          </w:tcPr>
+          <w:p>
+            <w:pPr>
+              <w:pStyle w:val="Normal"/>
+              <w:widowControl/>
+              <w:suppressAutoHyphens w:val="true"/>
               <w:spacing w:lineRule="auto" w:line="240" w:before="0" w:after="0"/>
               <w:jc w:val="end"/>
               <w:rPr>
@@ -9219,11 +9494,9 @@
             </w:pPr>
             <w:r>
               <w:rPr>
-                <w:rFonts w:eastAsia="Calibri" w:cs="Arial" w:ascii="Arial" w:hAnsi="Arial"/>
-                <w:kern w:val="0"/>
-                <w:sz w:val="20"/>
-                <w:szCs w:val="20"/>
-                <w:lang w:val="pt-BR" w:eastAsia="en-US" w:bidi="ar-SA"/>
+                <w:rFonts w:cs="Arial" w:ascii="Arial" w:hAnsi="Arial"/>
+                <w:sz w:val="20"/>
+                <w:szCs w:val="20"/>
               </w:rPr>
             </w:r>
           </w:p>
@@ -9233,13 +9506,14 @@
         <w:trPr/>
         <w:tc>
           <w:tcPr>
-            <w:tcW w:w="1667" w:type="dxa"/>
-            <w:tcBorders/>
-          </w:tcPr>
-          <w:p>
-            <w:pPr>
-              <w:pStyle w:val="Normal"/>
-              <w:widowControl/>
+            <w:tcW w:w="1666" w:type="dxa"/>
+            <w:tcBorders/>
+          </w:tcPr>
+          <w:p>
+            <w:pPr>
+              <w:pStyle w:val="Normal"/>
+              <w:widowControl/>
+              <w:suppressAutoHyphens w:val="true"/>
               <w:spacing w:lineRule="auto" w:line="240" w:before="0" w:after="0"/>
               <w:jc w:val="start"/>
               <w:rPr>
@@ -9262,13 +9536,14 @@
         </w:tc>
         <w:tc>
           <w:tcPr>
-            <w:tcW w:w="851" w:type="dxa"/>
-            <w:tcBorders/>
-          </w:tcPr>
-          <w:p>
-            <w:pPr>
-              <w:pStyle w:val="Normal"/>
-              <w:widowControl/>
+            <w:tcW w:w="852" w:type="dxa"/>
+            <w:tcBorders/>
+          </w:tcPr>
+          <w:p>
+            <w:pPr>
+              <w:pStyle w:val="Normal"/>
+              <w:widowControl/>
+              <w:suppressAutoHyphens w:val="true"/>
               <w:spacing w:lineRule="auto" w:line="240" w:before="0" w:after="0"/>
               <w:jc w:val="end"/>
               <w:rPr>
@@ -9294,13 +9569,14 @@
         <w:trPr/>
         <w:tc>
           <w:tcPr>
-            <w:tcW w:w="1667" w:type="dxa"/>
-            <w:tcBorders/>
-          </w:tcPr>
-          <w:p>
-            <w:pPr>
-              <w:pStyle w:val="Normal"/>
-              <w:widowControl/>
+            <w:tcW w:w="1666" w:type="dxa"/>
+            <w:tcBorders/>
+          </w:tcPr>
+          <w:p>
+            <w:pPr>
+              <w:pStyle w:val="Normal"/>
+              <w:widowControl/>
+              <w:suppressAutoHyphens w:val="true"/>
               <w:spacing w:lineRule="auto" w:line="240" w:before="0" w:after="0"/>
               <w:jc w:val="start"/>
               <w:rPr>
@@ -9323,13 +9599,14 @@
         </w:tc>
         <w:tc>
           <w:tcPr>
-            <w:tcW w:w="851" w:type="dxa"/>
-            <w:tcBorders/>
-          </w:tcPr>
-          <w:p>
-            <w:pPr>
-              <w:pStyle w:val="Normal"/>
-              <w:widowControl/>
+            <w:tcW w:w="852" w:type="dxa"/>
+            <w:tcBorders/>
+          </w:tcPr>
+          <w:p>
+            <w:pPr>
+              <w:pStyle w:val="Normal"/>
+              <w:widowControl/>
+              <w:suppressAutoHyphens w:val="true"/>
               <w:spacing w:lineRule="auto" w:line="240" w:before="0" w:after="0"/>
               <w:jc w:val="end"/>
               <w:rPr>
@@ -9355,13 +9632,14 @@
         <w:trPr/>
         <w:tc>
           <w:tcPr>
-            <w:tcW w:w="1667" w:type="dxa"/>
-            <w:tcBorders/>
-          </w:tcPr>
-          <w:p>
-            <w:pPr>
-              <w:pStyle w:val="Normal"/>
-              <w:widowControl/>
+            <w:tcW w:w="1666" w:type="dxa"/>
+            <w:tcBorders/>
+          </w:tcPr>
+          <w:p>
+            <w:pPr>
+              <w:pStyle w:val="Normal"/>
+              <w:widowControl/>
+              <w:suppressAutoHyphens w:val="true"/>
               <w:spacing w:lineRule="auto" w:line="240" w:before="0" w:after="0"/>
               <w:jc w:val="start"/>
               <w:rPr>
@@ -9384,13 +9662,14 @@
         </w:tc>
         <w:tc>
           <w:tcPr>
-            <w:tcW w:w="851" w:type="dxa"/>
-            <w:tcBorders/>
-          </w:tcPr>
-          <w:p>
-            <w:pPr>
-              <w:pStyle w:val="Normal"/>
-              <w:widowControl/>
+            <w:tcW w:w="852" w:type="dxa"/>
+            <w:tcBorders/>
+          </w:tcPr>
+          <w:p>
+            <w:pPr>
+              <w:pStyle w:val="Normal"/>
+              <w:widowControl/>
+              <w:suppressAutoHyphens w:val="true"/>
               <w:spacing w:lineRule="auto" w:line="240" w:before="0" w:after="0"/>
               <w:jc w:val="end"/>
               <w:rPr>
@@ -9416,13 +9695,14 @@
         <w:trPr/>
         <w:tc>
           <w:tcPr>
-            <w:tcW w:w="1667" w:type="dxa"/>
-            <w:tcBorders/>
-          </w:tcPr>
-          <w:p>
-            <w:pPr>
-              <w:pStyle w:val="Normal"/>
-              <w:widowControl/>
+            <w:tcW w:w="1666" w:type="dxa"/>
+            <w:tcBorders/>
+          </w:tcPr>
+          <w:p>
+            <w:pPr>
+              <w:pStyle w:val="Normal"/>
+              <w:widowControl/>
+              <w:suppressAutoHyphens w:val="true"/>
               <w:spacing w:lineRule="auto" w:line="240" w:before="0" w:after="0"/>
               <w:jc w:val="start"/>
               <w:rPr>
@@ -9446,13 +9726,14 @@
         </w:tc>
         <w:tc>
           <w:tcPr>
-            <w:tcW w:w="851" w:type="dxa"/>
-            <w:tcBorders/>
-          </w:tcPr>
-          <w:p>
-            <w:pPr>
-              <w:pStyle w:val="Normal"/>
-              <w:widowControl/>
+            <w:tcW w:w="852" w:type="dxa"/>
+            <w:tcBorders/>
+          </w:tcPr>
+          <w:p>
+            <w:pPr>
+              <w:pStyle w:val="Normal"/>
+              <w:widowControl/>
+              <w:suppressAutoHyphens w:val="true"/>
               <w:spacing w:lineRule="auto" w:line="240" w:before="0" w:after="0"/>
               <w:jc w:val="end"/>
               <w:rPr>
@@ -9463,11 +9744,9 @@
             </w:pPr>
             <w:r>
               <w:rPr>
-                <w:rFonts w:eastAsia="Calibri" w:cs="Arial" w:ascii="Arial" w:hAnsi="Arial"/>
-                <w:kern w:val="0"/>
-                <w:sz w:val="20"/>
-                <w:szCs w:val="20"/>
-                <w:lang w:val="pt-BR" w:eastAsia="en-US" w:bidi="ar-SA"/>
+                <w:rFonts w:cs="Arial" w:ascii="Arial" w:hAnsi="Arial"/>
+                <w:sz w:val="20"/>
+                <w:szCs w:val="20"/>
               </w:rPr>
             </w:r>
           </w:p>
@@ -9477,13 +9756,14 @@
         <w:trPr/>
         <w:tc>
           <w:tcPr>
-            <w:tcW w:w="1667" w:type="dxa"/>
-            <w:tcBorders/>
-          </w:tcPr>
-          <w:p>
-            <w:pPr>
-              <w:pStyle w:val="Normal"/>
-              <w:widowControl/>
+            <w:tcW w:w="1666" w:type="dxa"/>
+            <w:tcBorders/>
+          </w:tcPr>
+          <w:p>
+            <w:pPr>
+              <w:pStyle w:val="Normal"/>
+              <w:widowControl/>
+              <w:suppressAutoHyphens w:val="true"/>
               <w:spacing w:lineRule="auto" w:line="240" w:before="0" w:after="0"/>
               <w:jc w:val="start"/>
               <w:rPr>
@@ -9506,13 +9786,14 @@
         </w:tc>
         <w:tc>
           <w:tcPr>
-            <w:tcW w:w="851" w:type="dxa"/>
-            <w:tcBorders/>
-          </w:tcPr>
-          <w:p>
-            <w:pPr>
-              <w:pStyle w:val="Normal"/>
-              <w:widowControl/>
+            <w:tcW w:w="852" w:type="dxa"/>
+            <w:tcBorders/>
+          </w:tcPr>
+          <w:p>
+            <w:pPr>
+              <w:pStyle w:val="Normal"/>
+              <w:widowControl/>
+              <w:suppressAutoHyphens w:val="true"/>
               <w:spacing w:lineRule="auto" w:line="240" w:before="0" w:after="0"/>
               <w:jc w:val="end"/>
               <w:rPr>
@@ -9538,13 +9819,14 @@
         <w:trPr/>
         <w:tc>
           <w:tcPr>
-            <w:tcW w:w="1667" w:type="dxa"/>
-            <w:tcBorders/>
-          </w:tcPr>
-          <w:p>
-            <w:pPr>
-              <w:pStyle w:val="Normal"/>
-              <w:widowControl/>
+            <w:tcW w:w="1666" w:type="dxa"/>
+            <w:tcBorders/>
+          </w:tcPr>
+          <w:p>
+            <w:pPr>
+              <w:pStyle w:val="Normal"/>
+              <w:widowControl/>
+              <w:suppressAutoHyphens w:val="true"/>
               <w:spacing w:lineRule="auto" w:line="240" w:before="0" w:after="0"/>
               <w:jc w:val="start"/>
               <w:rPr>
@@ -9567,13 +9849,14 @@
         </w:tc>
         <w:tc>
           <w:tcPr>
-            <w:tcW w:w="851" w:type="dxa"/>
-            <w:tcBorders/>
-          </w:tcPr>
-          <w:p>
-            <w:pPr>
-              <w:pStyle w:val="Normal"/>
-              <w:widowControl/>
+            <w:tcW w:w="852" w:type="dxa"/>
+            <w:tcBorders/>
+          </w:tcPr>
+          <w:p>
+            <w:pPr>
+              <w:pStyle w:val="Normal"/>
+              <w:widowControl/>
+              <w:suppressAutoHyphens w:val="true"/>
               <w:spacing w:lineRule="auto" w:line="240" w:before="0" w:after="0"/>
               <w:jc w:val="end"/>
               <w:rPr>
@@ -9599,13 +9882,14 @@
         <w:trPr/>
         <w:tc>
           <w:tcPr>
-            <w:tcW w:w="1667" w:type="dxa"/>
-            <w:tcBorders/>
-          </w:tcPr>
-          <w:p>
-            <w:pPr>
-              <w:pStyle w:val="Normal"/>
-              <w:widowControl/>
+            <w:tcW w:w="1666" w:type="dxa"/>
+            <w:tcBorders/>
+          </w:tcPr>
+          <w:p>
+            <w:pPr>
+              <w:pStyle w:val="Normal"/>
+              <w:widowControl/>
+              <w:suppressAutoHyphens w:val="true"/>
               <w:spacing w:lineRule="auto" w:line="240" w:before="0" w:after="0"/>
               <w:jc w:val="start"/>
               <w:rPr>
@@ -9629,13 +9913,14 @@
         </w:tc>
         <w:tc>
           <w:tcPr>
-            <w:tcW w:w="851" w:type="dxa"/>
-            <w:tcBorders/>
-          </w:tcPr>
-          <w:p>
-            <w:pPr>
-              <w:pStyle w:val="Normal"/>
-              <w:widowControl/>
+            <w:tcW w:w="852" w:type="dxa"/>
+            <w:tcBorders/>
+          </w:tcPr>
+          <w:p>
+            <w:pPr>
+              <w:pStyle w:val="Normal"/>
+              <w:widowControl/>
+              <w:suppressAutoHyphens w:val="true"/>
               <w:spacing w:lineRule="auto" w:line="240" w:before="0" w:after="0"/>
               <w:jc w:val="end"/>
               <w:rPr>
@@ -9646,11 +9931,9 @@
             </w:pPr>
             <w:r>
               <w:rPr>
-                <w:rFonts w:eastAsia="Calibri" w:cs="Arial" w:ascii="Arial" w:hAnsi="Arial"/>
-                <w:kern w:val="0"/>
-                <w:sz w:val="20"/>
-                <w:szCs w:val="20"/>
-                <w:lang w:val="pt-BR" w:eastAsia="en-US" w:bidi="ar-SA"/>
+                <w:rFonts w:cs="Arial" w:ascii="Arial" w:hAnsi="Arial"/>
+                <w:sz w:val="20"/>
+                <w:szCs w:val="20"/>
               </w:rPr>
             </w:r>
           </w:p>
@@ -9660,13 +9943,14 @@
         <w:trPr/>
         <w:tc>
           <w:tcPr>
-            <w:tcW w:w="1667" w:type="dxa"/>
-            <w:tcBorders/>
-          </w:tcPr>
-          <w:p>
-            <w:pPr>
-              <w:pStyle w:val="Normal"/>
-              <w:widowControl/>
+            <w:tcW w:w="1666" w:type="dxa"/>
+            <w:tcBorders/>
+          </w:tcPr>
+          <w:p>
+            <w:pPr>
+              <w:pStyle w:val="Normal"/>
+              <w:widowControl/>
+              <w:suppressAutoHyphens w:val="true"/>
               <w:spacing w:lineRule="auto" w:line="240" w:before="0" w:after="0"/>
               <w:jc w:val="start"/>
               <w:rPr>
@@ -9689,13 +9973,14 @@
         </w:tc>
         <w:tc>
           <w:tcPr>
-            <w:tcW w:w="851" w:type="dxa"/>
-            <w:tcBorders/>
-          </w:tcPr>
-          <w:p>
-            <w:pPr>
-              <w:pStyle w:val="Normal"/>
-              <w:widowControl/>
+            <w:tcW w:w="852" w:type="dxa"/>
+            <w:tcBorders/>
+          </w:tcPr>
+          <w:p>
+            <w:pPr>
+              <w:pStyle w:val="Normal"/>
+              <w:widowControl/>
+              <w:suppressAutoHyphens w:val="true"/>
               <w:spacing w:lineRule="auto" w:line="240" w:before="0" w:after="0"/>
               <w:jc w:val="end"/>
               <w:rPr>
@@ -9721,13 +10006,14 @@
         <w:trPr/>
         <w:tc>
           <w:tcPr>
-            <w:tcW w:w="1667" w:type="dxa"/>
-            <w:tcBorders/>
-          </w:tcPr>
-          <w:p>
-            <w:pPr>
-              <w:pStyle w:val="Normal"/>
-              <w:widowControl/>
+            <w:tcW w:w="1666" w:type="dxa"/>
+            <w:tcBorders/>
+          </w:tcPr>
+          <w:p>
+            <w:pPr>
+              <w:pStyle w:val="Normal"/>
+              <w:widowControl/>
+              <w:suppressAutoHyphens w:val="true"/>
               <w:spacing w:lineRule="auto" w:line="240" w:before="0" w:after="0"/>
               <w:jc w:val="start"/>
               <w:rPr>
@@ -9750,13 +10036,14 @@
         </w:tc>
         <w:tc>
           <w:tcPr>
-            <w:tcW w:w="851" w:type="dxa"/>
-            <w:tcBorders/>
-          </w:tcPr>
-          <w:p>
-            <w:pPr>
-              <w:pStyle w:val="Normal"/>
-              <w:widowControl/>
+            <w:tcW w:w="852" w:type="dxa"/>
+            <w:tcBorders/>
+          </w:tcPr>
+          <w:p>
+            <w:pPr>
+              <w:pStyle w:val="Normal"/>
+              <w:widowControl/>
+              <w:suppressAutoHyphens w:val="true"/>
               <w:spacing w:lineRule="auto" w:line="240" w:before="0" w:after="0"/>
               <w:jc w:val="end"/>
               <w:rPr>
@@ -9782,13 +10069,14 @@
         <w:trPr/>
         <w:tc>
           <w:tcPr>
-            <w:tcW w:w="1667" w:type="dxa"/>
-            <w:tcBorders/>
-          </w:tcPr>
-          <w:p>
-            <w:pPr>
-              <w:pStyle w:val="Normal"/>
-              <w:widowControl/>
+            <w:tcW w:w="1666" w:type="dxa"/>
+            <w:tcBorders/>
+          </w:tcPr>
+          <w:p>
+            <w:pPr>
+              <w:pStyle w:val="Normal"/>
+              <w:widowControl/>
+              <w:suppressAutoHyphens w:val="true"/>
               <w:spacing w:lineRule="auto" w:line="240" w:before="0" w:after="0"/>
               <w:jc w:val="start"/>
               <w:rPr>
@@ -9812,13 +10100,14 @@
         </w:tc>
         <w:tc>
           <w:tcPr>
-            <w:tcW w:w="851" w:type="dxa"/>
-            <w:tcBorders/>
-          </w:tcPr>
-          <w:p>
-            <w:pPr>
-              <w:pStyle w:val="Normal"/>
-              <w:widowControl/>
+            <w:tcW w:w="852" w:type="dxa"/>
+            <w:tcBorders/>
+          </w:tcPr>
+          <w:p>
+            <w:pPr>
+              <w:pStyle w:val="Normal"/>
+              <w:widowControl/>
+              <w:suppressAutoHyphens w:val="true"/>
               <w:spacing w:lineRule="auto" w:line="240" w:before="0" w:after="0"/>
               <w:jc w:val="end"/>
               <w:rPr>
@@ -9829,11 +10118,9 @@
             </w:pPr>
             <w:r>
               <w:rPr>
-                <w:rFonts w:eastAsia="Calibri" w:cs="Arial" w:ascii="Arial" w:hAnsi="Arial"/>
-                <w:kern w:val="0"/>
-                <w:sz w:val="20"/>
-                <w:szCs w:val="20"/>
-                <w:lang w:val="pt-BR" w:eastAsia="en-US" w:bidi="ar-SA"/>
+                <w:rFonts w:cs="Arial" w:ascii="Arial" w:hAnsi="Arial"/>
+                <w:sz w:val="20"/>
+                <w:szCs w:val="20"/>
               </w:rPr>
             </w:r>
           </w:p>
@@ -9843,13 +10130,14 @@
         <w:trPr/>
         <w:tc>
           <w:tcPr>
-            <w:tcW w:w="1667" w:type="dxa"/>
-            <w:tcBorders/>
-          </w:tcPr>
-          <w:p>
-            <w:pPr>
-              <w:pStyle w:val="Normal"/>
-              <w:widowControl/>
+            <w:tcW w:w="1666" w:type="dxa"/>
+            <w:tcBorders/>
+          </w:tcPr>
+          <w:p>
+            <w:pPr>
+              <w:pStyle w:val="Normal"/>
+              <w:widowControl/>
+              <w:suppressAutoHyphens w:val="true"/>
               <w:spacing w:lineRule="auto" w:line="240" w:before="0" w:after="0"/>
               <w:jc w:val="start"/>
               <w:rPr>
@@ -9872,13 +10160,14 @@
         </w:tc>
         <w:tc>
           <w:tcPr>
-            <w:tcW w:w="851" w:type="dxa"/>
-            <w:tcBorders/>
-          </w:tcPr>
-          <w:p>
-            <w:pPr>
-              <w:pStyle w:val="Normal"/>
-              <w:widowControl/>
+            <w:tcW w:w="852" w:type="dxa"/>
+            <w:tcBorders/>
+          </w:tcPr>
+          <w:p>
+            <w:pPr>
+              <w:pStyle w:val="Normal"/>
+              <w:widowControl/>
+              <w:suppressAutoHyphens w:val="true"/>
               <w:spacing w:lineRule="auto" w:line="240" w:before="0" w:after="0"/>
               <w:jc w:val="end"/>
               <w:rPr>
@@ -9904,13 +10193,14 @@
         <w:trPr/>
         <w:tc>
           <w:tcPr>
-            <w:tcW w:w="1667" w:type="dxa"/>
-            <w:tcBorders/>
-          </w:tcPr>
-          <w:p>
-            <w:pPr>
-              <w:pStyle w:val="Normal"/>
-              <w:widowControl/>
+            <w:tcW w:w="1666" w:type="dxa"/>
+            <w:tcBorders/>
+          </w:tcPr>
+          <w:p>
+            <w:pPr>
+              <w:pStyle w:val="Normal"/>
+              <w:widowControl/>
+              <w:suppressAutoHyphens w:val="true"/>
               <w:spacing w:lineRule="auto" w:line="240" w:before="0" w:after="0"/>
               <w:jc w:val="start"/>
               <w:rPr>
@@ -9935,13 +10225,14 @@
         </w:tc>
         <w:tc>
           <w:tcPr>
-            <w:tcW w:w="851" w:type="dxa"/>
-            <w:tcBorders/>
-          </w:tcPr>
-          <w:p>
-            <w:pPr>
-              <w:pStyle w:val="Normal"/>
-              <w:widowControl/>
+            <w:tcW w:w="852" w:type="dxa"/>
+            <w:tcBorders/>
+          </w:tcPr>
+          <w:p>
+            <w:pPr>
+              <w:pStyle w:val="Normal"/>
+              <w:widowControl/>
+              <w:suppressAutoHyphens w:val="true"/>
               <w:spacing w:lineRule="auto" w:line="240" w:before="0" w:after="0"/>
               <w:jc w:val="end"/>
               <w:rPr>
@@ -10000,20 +10291,21 @@
         <w:tblLook w:val="04a0" w:firstRow="1" w:noVBand="1" w:lastRow="0" w:firstColumn="1" w:lastColumn="0" w:noHBand="0"/>
       </w:tblPr>
       <w:tblGrid>
-        <w:gridCol w:w="1667"/>
-        <w:gridCol w:w="851"/>
+        <w:gridCol w:w="1666"/>
+        <w:gridCol w:w="852"/>
       </w:tblGrid>
       <w:tr>
         <w:trPr/>
         <w:tc>
           <w:tcPr>
-            <w:tcW w:w="1667" w:type="dxa"/>
-            <w:tcBorders/>
-          </w:tcPr>
-          <w:p>
-            <w:pPr>
-              <w:pStyle w:val="Normal"/>
-              <w:widowControl/>
+            <w:tcW w:w="1666" w:type="dxa"/>
+            <w:tcBorders/>
+          </w:tcPr>
+          <w:p>
+            <w:pPr>
+              <w:pStyle w:val="Normal"/>
+              <w:widowControl/>
+              <w:suppressAutoHyphens w:val="true"/>
               <w:spacing w:lineRule="auto" w:line="240" w:before="0" w:after="0"/>
               <w:jc w:val="start"/>
               <w:rPr>
@@ -10036,13 +10328,14 @@
         </w:tc>
         <w:tc>
           <w:tcPr>
-            <w:tcW w:w="851" w:type="dxa"/>
-            <w:tcBorders/>
-          </w:tcPr>
-          <w:p>
-            <w:pPr>
-              <w:pStyle w:val="Normal"/>
-              <w:widowControl/>
+            <w:tcW w:w="852" w:type="dxa"/>
+            <w:tcBorders/>
+          </w:tcPr>
+          <w:p>
+            <w:pPr>
+              <w:pStyle w:val="Normal"/>
+              <w:widowControl/>
+              <w:suppressAutoHyphens w:val="true"/>
               <w:spacing w:lineRule="auto" w:line="240" w:before="0" w:after="0"/>
               <w:jc w:val="end"/>
               <w:rPr>
@@ -10068,13 +10361,14 @@
         <w:trPr/>
         <w:tc>
           <w:tcPr>
-            <w:tcW w:w="1667" w:type="dxa"/>
-            <w:tcBorders/>
-          </w:tcPr>
-          <w:p>
-            <w:pPr>
-              <w:pStyle w:val="Normal"/>
-              <w:widowControl/>
+            <w:tcW w:w="1666" w:type="dxa"/>
+            <w:tcBorders/>
+          </w:tcPr>
+          <w:p>
+            <w:pPr>
+              <w:pStyle w:val="Normal"/>
+              <w:widowControl/>
+              <w:suppressAutoHyphens w:val="true"/>
               <w:spacing w:lineRule="auto" w:line="240" w:before="0" w:after="0"/>
               <w:jc w:val="start"/>
               <w:rPr>
@@ -10097,13 +10391,14 @@
         </w:tc>
         <w:tc>
           <w:tcPr>
-            <w:tcW w:w="851" w:type="dxa"/>
-            <w:tcBorders/>
-          </w:tcPr>
-          <w:p>
-            <w:pPr>
-              <w:pStyle w:val="Normal"/>
-              <w:widowControl/>
+            <w:tcW w:w="852" w:type="dxa"/>
+            <w:tcBorders/>
+          </w:tcPr>
+          <w:p>
+            <w:pPr>
+              <w:pStyle w:val="Normal"/>
+              <w:widowControl/>
+              <w:suppressAutoHyphens w:val="true"/>
               <w:spacing w:lineRule="auto" w:line="240" w:before="0" w:after="0"/>
               <w:jc w:val="end"/>
               <w:rPr>
@@ -10129,13 +10424,14 @@
         <w:trPr/>
         <w:tc>
           <w:tcPr>
-            <w:tcW w:w="1667" w:type="dxa"/>
-            <w:tcBorders/>
-          </w:tcPr>
-          <w:p>
-            <w:pPr>
-              <w:pStyle w:val="Normal"/>
-              <w:widowControl/>
+            <w:tcW w:w="1666" w:type="dxa"/>
+            <w:tcBorders/>
+          </w:tcPr>
+          <w:p>
+            <w:pPr>
+              <w:pStyle w:val="Normal"/>
+              <w:widowControl/>
+              <w:suppressAutoHyphens w:val="true"/>
               <w:spacing w:lineRule="auto" w:line="240" w:before="0" w:after="0"/>
               <w:jc w:val="start"/>
               <w:rPr>
@@ -10158,13 +10454,14 @@
         </w:tc>
         <w:tc>
           <w:tcPr>
-            <w:tcW w:w="851" w:type="dxa"/>
-            <w:tcBorders/>
-          </w:tcPr>
-          <w:p>
-            <w:pPr>
-              <w:pStyle w:val="Normal"/>
-              <w:widowControl/>
+            <w:tcW w:w="852" w:type="dxa"/>
+            <w:tcBorders/>
+          </w:tcPr>
+          <w:p>
+            <w:pPr>
+              <w:pStyle w:val="Normal"/>
+              <w:widowControl/>
+              <w:suppressAutoHyphens w:val="true"/>
               <w:spacing w:lineRule="auto" w:line="240" w:before="0" w:after="0"/>
               <w:jc w:val="end"/>
               <w:rPr>
@@ -10190,13 +10487,14 @@
         <w:trPr/>
         <w:tc>
           <w:tcPr>
-            <w:tcW w:w="1667" w:type="dxa"/>
-            <w:tcBorders/>
-          </w:tcPr>
-          <w:p>
-            <w:pPr>
-              <w:pStyle w:val="Normal"/>
-              <w:widowControl/>
+            <w:tcW w:w="1666" w:type="dxa"/>
+            <w:tcBorders/>
+          </w:tcPr>
+          <w:p>
+            <w:pPr>
+              <w:pStyle w:val="Normal"/>
+              <w:widowControl/>
+              <w:suppressAutoHyphens w:val="true"/>
               <w:spacing w:lineRule="auto" w:line="240" w:before="0" w:after="0"/>
               <w:jc w:val="start"/>
               <w:rPr>
@@ -10219,13 +10517,14 @@
         </w:tc>
         <w:tc>
           <w:tcPr>
-            <w:tcW w:w="851" w:type="dxa"/>
-            <w:tcBorders/>
-          </w:tcPr>
-          <w:p>
-            <w:pPr>
-              <w:pStyle w:val="Normal"/>
-              <w:widowControl/>
+            <w:tcW w:w="852" w:type="dxa"/>
+            <w:tcBorders/>
+          </w:tcPr>
+          <w:p>
+            <w:pPr>
+              <w:pStyle w:val="Normal"/>
+              <w:widowControl/>
+              <w:suppressAutoHyphens w:val="true"/>
               <w:spacing w:lineRule="auto" w:line="240" w:before="0" w:after="0"/>
               <w:jc w:val="end"/>
               <w:rPr>
@@ -10251,13 +10550,14 @@
         <w:trPr/>
         <w:tc>
           <w:tcPr>
-            <w:tcW w:w="1667" w:type="dxa"/>
-            <w:tcBorders/>
-          </w:tcPr>
-          <w:p>
-            <w:pPr>
-              <w:pStyle w:val="Normal"/>
-              <w:widowControl/>
+            <w:tcW w:w="1666" w:type="dxa"/>
+            <w:tcBorders/>
+          </w:tcPr>
+          <w:p>
+            <w:pPr>
+              <w:pStyle w:val="Normal"/>
+              <w:widowControl/>
+              <w:suppressAutoHyphens w:val="true"/>
               <w:spacing w:lineRule="auto" w:line="240" w:before="0" w:after="0"/>
               <w:jc w:val="start"/>
               <w:rPr>
@@ -10280,13 +10580,14 @@
         </w:tc>
         <w:tc>
           <w:tcPr>
-            <w:tcW w:w="851" w:type="dxa"/>
-            <w:tcBorders/>
-          </w:tcPr>
-          <w:p>
-            <w:pPr>
-              <w:pStyle w:val="Normal"/>
-              <w:widowControl/>
+            <w:tcW w:w="852" w:type="dxa"/>
+            <w:tcBorders/>
+          </w:tcPr>
+          <w:p>
+            <w:pPr>
+              <w:pStyle w:val="Normal"/>
+              <w:widowControl/>
+              <w:suppressAutoHyphens w:val="true"/>
               <w:spacing w:lineRule="auto" w:line="240" w:before="0" w:after="0"/>
               <w:jc w:val="end"/>
               <w:rPr>
@@ -10312,13 +10613,14 @@
         <w:trPr/>
         <w:tc>
           <w:tcPr>
-            <w:tcW w:w="1667" w:type="dxa"/>
-            <w:tcBorders/>
-          </w:tcPr>
-          <w:p>
-            <w:pPr>
-              <w:pStyle w:val="Normal"/>
-              <w:widowControl/>
+            <w:tcW w:w="1666" w:type="dxa"/>
+            <w:tcBorders/>
+          </w:tcPr>
+          <w:p>
+            <w:pPr>
+              <w:pStyle w:val="Normal"/>
+              <w:widowControl/>
+              <w:suppressAutoHyphens w:val="true"/>
               <w:spacing w:lineRule="auto" w:line="240" w:before="0" w:after="0"/>
               <w:jc w:val="start"/>
               <w:rPr>
@@ -10341,13 +10643,14 @@
         </w:tc>
         <w:tc>
           <w:tcPr>
-            <w:tcW w:w="851" w:type="dxa"/>
-            <w:tcBorders/>
-          </w:tcPr>
-          <w:p>
-            <w:pPr>
-              <w:pStyle w:val="Normal"/>
-              <w:widowControl/>
+            <w:tcW w:w="852" w:type="dxa"/>
+            <w:tcBorders/>
+          </w:tcPr>
+          <w:p>
+            <w:pPr>
+              <w:pStyle w:val="Normal"/>
+              <w:widowControl/>
+              <w:suppressAutoHyphens w:val="true"/>
               <w:spacing w:lineRule="auto" w:line="240" w:before="0" w:after="0"/>
               <w:jc w:val="end"/>
               <w:rPr>
@@ -10438,7 +10741,6 @@
       </w:pPr>
       <w:r>
         <w:rPr>
-          <w:rFonts w:ascii="Calibri" w:hAnsi="Calibri"/>
           <w:b/>
           <w:bCs/>
           <w:i/>
@@ -10449,7 +10751,6 @@
       </w:r>
       <w:r>
         <w:rPr>
-          <w:rFonts w:ascii="Calibri" w:hAnsi="Calibri"/>
           <w:color w:val="000000"/>
         </w:rPr>
         <w:t>Inclui uma mochila, um saco de</w:t>
@@ -10461,7 +10762,6 @@
       </w:r>
       <w:r>
         <w:rPr>
-          <w:rFonts w:ascii="Calibri" w:hAnsi="Calibri"/>
           <w:b/>
           <w:bCs/>
           <w:i/>
@@ -10472,7 +10772,6 @@
       </w:r>
       <w:r>
         <w:rPr>
-          <w:rFonts w:ascii="Calibri" w:hAnsi="Calibri"/>
           <w:color w:val="000000"/>
         </w:rPr>
         <w:t>Inclui uma mochila, um saco</w:t>
@@ -10490,7 +10789,6 @@
       </w:r>
       <w:r>
         <w:rPr>
-          <w:rFonts w:ascii="Calibri" w:hAnsi="Calibri"/>
           <w:b/>
           <w:bCs/>
           <w:i/>
@@ -10501,7 +10799,6 @@
       </w:r>
       <w:r>
         <w:rPr>
-          <w:rFonts w:ascii="Calibri" w:hAnsi="Calibri"/>
           <w:color w:val="000000"/>
         </w:rPr>
         <w:t>Inclui uma mochila, um pé de</w:t>
@@ -10515,7 +10812,6 @@
       </w:r>
       <w:r>
         <w:rPr>
-          <w:rFonts w:ascii="Calibri" w:hAnsi="Calibri"/>
           <w:b/>
           <w:bCs/>
           <w:i/>
@@ -10526,7 +10822,6 @@
       </w:r>
       <w:r>
         <w:rPr>
-          <w:rFonts w:ascii="Calibri" w:hAnsi="Calibri"/>
           <w:color w:val="000000"/>
         </w:rPr>
         <w:t>Inclui um baú, 2 caixas para</w:t>
@@ -10540,7 +10835,6 @@
       </w:r>
       <w:r>
         <w:rPr>
-          <w:rFonts w:ascii="Calibri" w:hAnsi="Calibri"/>
           <w:b/>
           <w:bCs/>
           <w:i/>
@@ -10551,7 +10845,6 @@
       </w:r>
       <w:r>
         <w:rPr>
-          <w:rFonts w:ascii="Calibri" w:hAnsi="Calibri"/>
           <w:color w:val="000000"/>
         </w:rPr>
         <w:t>Inclui uma mochila, um livro de</w:t>
@@ -10563,7 +10856,6 @@
       </w:r>
       <w:r>
         <w:rPr>
-          <w:rFonts w:ascii="Calibri" w:hAnsi="Calibri"/>
           <w:b/>
           <w:bCs/>
           <w:i/>
@@ -10574,7 +10866,6 @@
       </w:r>
       <w:r>
         <w:rPr>
-          <w:rFonts w:ascii="Calibri" w:hAnsi="Calibri"/>
           <w:color w:val="000000"/>
         </w:rPr>
         <w:t>Inclui uma mochila, um saco de</w:t>
@@ -10588,7 +10879,6 @@
       </w:r>
       <w:r>
         <w:rPr>
-          <w:rFonts w:ascii="Calibri" w:hAnsi="Calibri"/>
           <w:b/>
           <w:bCs/>
           <w:i/>
@@ -10599,7 +10889,6 @@
       </w:r>
       <w:r>
         <w:rPr>
-          <w:rFonts w:ascii="Calibri" w:hAnsi="Calibri"/>
           <w:color w:val="000000"/>
         </w:rPr>
         <w:t>Inclui uma mochila, um</w:t>
@@ -11717,9 +12006,9 @@
       <w:pgMar w:left="1134" w:right="1134" w:gutter="0" w:header="0" w:top="709" w:footer="0" w:bottom="709"/>
       <w:cols w:num="4" w:equalWidth="false" w:sep="false">
         <w:col w:w="6804" w:space="56"/>
-        <w:col w:w="2457" w:space="56"/>
-        <w:col w:w="2522" w:space="56"/>
-        <w:col w:w="2617"/>
+        <w:col w:w="2456" w:space="56"/>
+        <w:col w:w="2521" w:space="56"/>
+        <w:col w:w="2618"/>
       </w:cols>
       <w:formProt w:val="false"/>
       <w:textDirection w:val="lrTb"/>
@@ -11891,6 +12180,7 @@
     <w:rsid w:val="00b2114b"/>
     <w:pPr>
       <w:widowControl/>
+      <w:suppressAutoHyphens w:val="true"/>
       <w:bidi w:val="0"/>
       <w:spacing w:lineRule="auto" w:line="259" w:before="0" w:after="160"/>
       <w:jc w:val="start"/>
@@ -12000,6 +12290,32 @@
       <w:rFonts w:cs="Arial"/>
     </w:rPr>
   </w:style>
+  <w:style w:type="paragraph" w:styleId="Ttulouser">
+    <w:name w:val="Título (user)"/>
+    <w:basedOn w:val="Normal"/>
+    <w:next w:val="BodyText"/>
+    <w:qFormat/>
+    <w:pPr>
+      <w:keepNext w:val="true"/>
+      <w:spacing w:before="240" w:after="120"/>
+    </w:pPr>
+    <w:rPr>
+      <w:rFonts w:ascii="Liberation Sans" w:hAnsi="Liberation Sans" w:eastAsia="Microsoft YaHei" w:cs="Arial"/>
+      <w:sz w:val="28"/>
+      <w:szCs w:val="28"/>
+    </w:rPr>
+  </w:style>
+  <w:style w:type="paragraph" w:styleId="ndiceuser">
+    <w:name w:val="Índice (user)"/>
+    <w:basedOn w:val="Normal"/>
+    <w:qFormat/>
+    <w:pPr>
+      <w:suppressLineNumbers/>
+    </w:pPr>
+    <w:rPr>
+      <w:rFonts w:cs="Arial"/>
+    </w:rPr>
+  </w:style>
   <w:style w:type="paragraph" w:styleId="BalloonText">
     <w:name w:val="Balloon Text"/>
     <w:basedOn w:val="Normal"/>
@@ -12029,6 +12345,13 @@
       <w:ind w:start="720"/>
       <w:contextualSpacing/>
     </w:pPr>
+    <w:rPr/>
+  </w:style>
+  <w:style w:type="paragraph" w:styleId="Cabealhoerodapuser">
+    <w:name w:val="Cabeçalho e rodapé (user)"/>
+    <w:basedOn w:val="Normal"/>
+    <w:qFormat/>
+    <w:pPr/>
     <w:rPr/>
   </w:style>
   <w:style w:type="paragraph" w:styleId="Cabealhoerodap">
@@ -12072,8 +12395,8 @@
     </w:pPr>
     <w:rPr/>
   </w:style>
-  <w:style w:type="numbering" w:styleId="Semlista" w:default="1">
-    <w:name w:val="Sem lista"/>
+  <w:style w:type="numbering" w:styleId="Semlistauser" w:default="1">
+    <w:name w:val="Sem lista (user)"/>
     <w:uiPriority w:val="99"/>
     <w:semiHidden/>
     <w:unhideWhenUsed/>

</xml_diff>